<commit_message>
Regenerate legal PDF/docx v1.6/v1.5 — previous files were corrupted
The committed v1.6 privacy policy and v1.5 terms files could not be
opened. Regenerated via the established pandoc -> docx -> Word COM ->
PDF pipeline from the current external source markdown (5 August 2026
effective date, unchanged). Verified page-by-page after conversion:
8-page privacy policy PDF, 7-page terms PDF, both with working table
of contents; both docx files pass zip-integrity checks.

Co-Authored-By: Claude Sonnet 5 <noreply@anthropic.com>
</commit_message>
<xml_diff>
--- a/docs/legal/pdf/Grant-Pathway-Terms-of-Service-v1.5.docx
+++ b/docs/legal/pdf/Grant-Pathway-Terms-of-Service-v1.5.docx
@@ -1,15 +1,1122 @@
 
 <file path=word/document.xml><?xml version="1.0" encoding="utf-8"?>
-<w:document xmlns:w="http://schemas.openxmlformats.org/wordprocessingml/2006/main" xmlns:m="http://schemas.openxmlformats.org/officeDocument/2006/math" xmlns:r="http://schemas.openxmlformats.org/officeDocument/2006/relationships" xmlns:o="urn:schemas-microsoft-com:office:office" xmlns:v="urn:schemas-microsoft-com:vml" xmlns:w10="urn:schemas-microsoft-com:office:word" xmlns:a="http://schemas.openxmlformats.org/drawingml/2006/main" xmlns:pic="http://schemas.openxmlformats.org/drawingml/2006/picture" xmlns:wp="http://schemas.openxmlformats.org/drawingml/2006/wordprocessingDrawing">
+<w:document xmlns:wpc="http://schemas.microsoft.com/office/word/2010/wordprocessingCanvas" xmlns:cx="http://schemas.microsoft.com/office/drawing/2014/chartex" xmlns:cx1="http://schemas.microsoft.com/office/drawing/2015/9/8/chartex" xmlns:cx2="http://schemas.microsoft.com/office/drawing/2015/10/21/chartex" xmlns:cx3="http://schemas.microsoft.com/office/drawing/2016/5/9/chartex" xmlns:cx4="http://schemas.microsoft.com/office/drawing/2016/5/10/chartex" xmlns:cx5="http://schemas.microsoft.com/office/drawing/2016/5/11/chartex" xmlns:cx6="http://schemas.microsoft.com/office/drawing/2016/5/12/chartex" xmlns:cx7="http://schemas.microsoft.com/office/drawing/2016/5/13/chartex" xmlns:cx8="http://schemas.microsoft.com/office/drawing/2016/5/14/chartex" xmlns:mc="http://schemas.openxmlformats.org/markup-compatibility/2006" xmlns:aink="http://schemas.microsoft.com/office/drawing/2016/ink" xmlns:am3d="http://schemas.microsoft.com/office/drawing/2017/model3d" xmlns:o="urn:schemas-microsoft-com:office:office" xmlns:oel="http://schemas.microsoft.com/office/2019/extlst" xmlns:r="http://schemas.openxmlformats.org/officeDocument/2006/relationships" xmlns:m="http://schemas.openxmlformats.org/officeDocument/2006/math" xmlns:v="urn:schemas-microsoft-com:vml" xmlns:wp14="http://schemas.microsoft.com/office/word/2010/wordprocessingDrawing" xmlns:wp="http://schemas.openxmlformats.org/drawingml/2006/wordprocessingDrawing" xmlns:w10="urn:schemas-microsoft-com:office:word" xmlns:w="http://schemas.openxmlformats.org/wordprocessingml/2006/main" xmlns:w14="http://schemas.microsoft.com/office/word/2010/wordml" xmlns:w15="http://schemas.microsoft.com/office/word/2012/wordml" xmlns:w16cei="http://schemas.microsoft.com/office/word/2026/wordml/cei" xmlns:w16cex="http://schemas.microsoft.com/office/word/2018/wordml/cex" xmlns:w16cid="http://schemas.microsoft.com/office/word/2016/wordml/cid" xmlns:w16="http://schemas.microsoft.com/office/word/2018/wordml" xmlns:w16du="http://schemas.microsoft.com/office/word/2023/wordml/word16du" xmlns:w16sdtdh="http://schemas.microsoft.com/office/word/2020/wordml/sdtdatahash" xmlns:w16sdtfl="http://schemas.microsoft.com/office/word/2024/wordml/sdtformatlock" xmlns:w16se="http://schemas.microsoft.com/office/word/2015/wordml/symex" xmlns:wpg="http://schemas.microsoft.com/office/word/2010/wordprocessingGroup" xmlns:wpi="http://schemas.microsoft.com/office/word/2010/wordprocessingInk" xmlns:wne="http://schemas.microsoft.com/office/word/2006/wordml" xmlns:wps="http://schemas.microsoft.com/office/word/2010/wordprocessingShape" mc:Ignorable="w14 w15 w16se w16cid w16 w16cex w16sdtdh w16sdtfl w16du wp14">
   <w:body>
-    <w:bookmarkStart w:id="23" w:name="grant-pathway-terms-of-service"/>
+    <w:sdt>
+      <w:sdtPr>
+        <w:rPr>
+          <w:rFonts w:asciiTheme="minorHAnsi" w:eastAsiaTheme="minorEastAsia" w:hAnsiTheme="minorHAnsi" w:cstheme="minorBidi"/>
+          <w:color w:val="auto"/>
+          <w:sz w:val="24"/>
+          <w:szCs w:val="24"/>
+        </w:rPr>
+        <w:id w:val="-1677101573"/>
+        <w:docPartObj>
+          <w:docPartGallery w:val="Table of Contents"/>
+          <w:docPartUnique/>
+        </w:docPartObj>
+      </w:sdtPr>
+      <w:sdtEndPr/>
+      <w:sdtContent>
+        <w:p>
+          <w:pPr>
+            <w:pStyle w:val="TOCHeading"/>
+          </w:pPr>
+          <w:r>
+            <w:t>Table of Contents</w:t>
+          </w:r>
+        </w:p>
+        <w:p>
+          <w:pPr>
+            <w:pStyle w:val="TOC1"/>
+            <w:tabs>
+              <w:tab w:val="right" w:leader="dot" w:pos="9350"/>
+            </w:tabs>
+            <w:rPr>
+              <w:noProof/>
+              <w:kern w:val="2"/>
+              <w:lang w:val="en-GB" w:eastAsia="en-GB"/>
+              <w14:ligatures w14:val="standardContextual"/>
+            </w:rPr>
+          </w:pPr>
+          <w:r>
+            <w:fldChar w:fldCharType="begin"/>
+          </w:r>
+          <w:r>
+            <w:instrText>TOC \o "1-3" \h \z \u</w:instrText>
+          </w:r>
+          <w:r>
+            <w:fldChar w:fldCharType="separate"/>
+          </w:r>
+          <w:hyperlink w:anchor="_Toc236832792" w:history="1">
+            <w:r>
+              <w:rPr>
+                <w:rStyle w:val="Hyperlink"/>
+                <w:noProof/>
+              </w:rPr>
+              <w:t>Grant Pathway — Terms of Service</w:t>
+            </w:r>
+            <w:r>
+              <w:rPr>
+                <w:noProof/>
+                <w:webHidden/>
+              </w:rPr>
+              <w:tab/>
+            </w:r>
+            <w:r>
+              <w:rPr>
+                <w:noProof/>
+                <w:webHidden/>
+              </w:rPr>
+              <w:fldChar w:fldCharType="begin"/>
+            </w:r>
+            <w:r>
+              <w:rPr>
+                <w:noProof/>
+                <w:webHidden/>
+              </w:rPr>
+              <w:instrText xml:space="preserve"> PAGEREF _Toc236832792 \h </w:instrText>
+            </w:r>
+            <w:r>
+              <w:rPr>
+                <w:noProof/>
+                <w:webHidden/>
+              </w:rPr>
+            </w:r>
+            <w:r>
+              <w:rPr>
+                <w:noProof/>
+                <w:webHidden/>
+              </w:rPr>
+              <w:fldChar w:fldCharType="separate"/>
+            </w:r>
+            <w:r>
+              <w:rPr>
+                <w:noProof/>
+                <w:webHidden/>
+              </w:rPr>
+              <w:t>1</w:t>
+            </w:r>
+            <w:r>
+              <w:rPr>
+                <w:noProof/>
+                <w:webHidden/>
+              </w:rPr>
+              <w:fldChar w:fldCharType="end"/>
+            </w:r>
+          </w:hyperlink>
+        </w:p>
+        <w:p>
+          <w:pPr>
+            <w:pStyle w:val="TOC2"/>
+            <w:tabs>
+              <w:tab w:val="right" w:leader="dot" w:pos="9350"/>
+            </w:tabs>
+            <w:rPr>
+              <w:noProof/>
+              <w:kern w:val="2"/>
+              <w:lang w:val="en-GB" w:eastAsia="en-GB"/>
+              <w14:ligatures w14:val="standardContextual"/>
+            </w:rPr>
+          </w:pPr>
+          <w:hyperlink w:anchor="_Toc236832793" w:history="1">
+            <w:r>
+              <w:rPr>
+                <w:rStyle w:val="Hyperlink"/>
+                <w:noProof/>
+              </w:rPr>
+              <w:t>1. Introduction</w:t>
+            </w:r>
+            <w:r>
+              <w:rPr>
+                <w:noProof/>
+                <w:webHidden/>
+              </w:rPr>
+              <w:tab/>
+            </w:r>
+            <w:r>
+              <w:rPr>
+                <w:noProof/>
+                <w:webHidden/>
+              </w:rPr>
+              <w:fldChar w:fldCharType="begin"/>
+            </w:r>
+            <w:r>
+              <w:rPr>
+                <w:noProof/>
+                <w:webHidden/>
+              </w:rPr>
+              <w:instrText xml:space="preserve"> PAGEREF _Toc236832793 \h </w:instrText>
+            </w:r>
+            <w:r>
+              <w:rPr>
+                <w:noProof/>
+                <w:webHidden/>
+              </w:rPr>
+            </w:r>
+            <w:r>
+              <w:rPr>
+                <w:noProof/>
+                <w:webHidden/>
+              </w:rPr>
+              <w:fldChar w:fldCharType="separate"/>
+            </w:r>
+            <w:r>
+              <w:rPr>
+                <w:noProof/>
+                <w:webHidden/>
+              </w:rPr>
+              <w:t>1</w:t>
+            </w:r>
+            <w:r>
+              <w:rPr>
+                <w:noProof/>
+                <w:webHidden/>
+              </w:rPr>
+              <w:fldChar w:fldCharType="end"/>
+            </w:r>
+          </w:hyperlink>
+        </w:p>
+        <w:p>
+          <w:pPr>
+            <w:pStyle w:val="TOC2"/>
+            <w:tabs>
+              <w:tab w:val="right" w:leader="dot" w:pos="9350"/>
+            </w:tabs>
+            <w:rPr>
+              <w:noProof/>
+              <w:kern w:val="2"/>
+              <w:lang w:val="en-GB" w:eastAsia="en-GB"/>
+              <w14:ligatures w14:val="standardContextual"/>
+            </w:rPr>
+          </w:pPr>
+          <w:hyperlink w:anchor="_Toc236832794" w:history="1">
+            <w:r>
+              <w:rPr>
+                <w:rStyle w:val="Hyperlink"/>
+                <w:noProof/>
+              </w:rPr>
+              <w:t>2. Who Can Use Grant Pathway</w:t>
+            </w:r>
+            <w:r>
+              <w:rPr>
+                <w:noProof/>
+                <w:webHidden/>
+              </w:rPr>
+              <w:tab/>
+            </w:r>
+            <w:r>
+              <w:rPr>
+                <w:noProof/>
+                <w:webHidden/>
+              </w:rPr>
+              <w:fldChar w:fldCharType="begin"/>
+            </w:r>
+            <w:r>
+              <w:rPr>
+                <w:noProof/>
+                <w:webHidden/>
+              </w:rPr>
+              <w:instrText xml:space="preserve"> PAGEREF _Toc236832794 \h </w:instrText>
+            </w:r>
+            <w:r>
+              <w:rPr>
+                <w:noProof/>
+                <w:webHidden/>
+              </w:rPr>
+            </w:r>
+            <w:r>
+              <w:rPr>
+                <w:noProof/>
+                <w:webHidden/>
+              </w:rPr>
+              <w:fldChar w:fldCharType="separate"/>
+            </w:r>
+            <w:r>
+              <w:rPr>
+                <w:noProof/>
+                <w:webHidden/>
+              </w:rPr>
+              <w:t>2</w:t>
+            </w:r>
+            <w:r>
+              <w:rPr>
+                <w:noProof/>
+                <w:webHidden/>
+              </w:rPr>
+              <w:fldChar w:fldCharType="end"/>
+            </w:r>
+          </w:hyperlink>
+        </w:p>
+        <w:p>
+          <w:pPr>
+            <w:pStyle w:val="TOC2"/>
+            <w:tabs>
+              <w:tab w:val="right" w:leader="dot" w:pos="9350"/>
+            </w:tabs>
+            <w:rPr>
+              <w:noProof/>
+              <w:kern w:val="2"/>
+              <w:lang w:val="en-GB" w:eastAsia="en-GB"/>
+              <w14:ligatures w14:val="standardContextual"/>
+            </w:rPr>
+          </w:pPr>
+          <w:hyperlink w:anchor="_Toc236832795" w:history="1">
+            <w:r>
+              <w:rPr>
+                <w:rStyle w:val="Hyperlink"/>
+                <w:noProof/>
+              </w:rPr>
+              <w:t>3. Your Account</w:t>
+            </w:r>
+            <w:r>
+              <w:rPr>
+                <w:noProof/>
+                <w:webHidden/>
+              </w:rPr>
+              <w:tab/>
+            </w:r>
+            <w:r>
+              <w:rPr>
+                <w:noProof/>
+                <w:webHidden/>
+              </w:rPr>
+              <w:fldChar w:fldCharType="begin"/>
+            </w:r>
+            <w:r>
+              <w:rPr>
+                <w:noProof/>
+                <w:webHidden/>
+              </w:rPr>
+              <w:instrText xml:space="preserve"> PAGEREF _Toc236832795 \h </w:instrText>
+            </w:r>
+            <w:r>
+              <w:rPr>
+                <w:noProof/>
+                <w:webHidden/>
+              </w:rPr>
+            </w:r>
+            <w:r>
+              <w:rPr>
+                <w:noProof/>
+                <w:webHidden/>
+              </w:rPr>
+              <w:fldChar w:fldCharType="separate"/>
+            </w:r>
+            <w:r>
+              <w:rPr>
+                <w:noProof/>
+                <w:webHidden/>
+              </w:rPr>
+              <w:t>2</w:t>
+            </w:r>
+            <w:r>
+              <w:rPr>
+                <w:noProof/>
+                <w:webHidden/>
+              </w:rPr>
+              <w:fldChar w:fldCharType="end"/>
+            </w:r>
+          </w:hyperlink>
+        </w:p>
+        <w:p>
+          <w:pPr>
+            <w:pStyle w:val="TOC2"/>
+            <w:tabs>
+              <w:tab w:val="right" w:leader="dot" w:pos="9350"/>
+            </w:tabs>
+            <w:rPr>
+              <w:noProof/>
+              <w:kern w:val="2"/>
+              <w:lang w:val="en-GB" w:eastAsia="en-GB"/>
+              <w14:ligatures w14:val="standardContextual"/>
+            </w:rPr>
+          </w:pPr>
+          <w:hyperlink w:anchor="_Toc236832796" w:history="1">
+            <w:r>
+              <w:rPr>
+                <w:rStyle w:val="Hyperlink"/>
+                <w:noProof/>
+              </w:rPr>
+              <w:t>4. Using the Service</w:t>
+            </w:r>
+            <w:r>
+              <w:rPr>
+                <w:noProof/>
+                <w:webHidden/>
+              </w:rPr>
+              <w:tab/>
+            </w:r>
+            <w:r>
+              <w:rPr>
+                <w:noProof/>
+                <w:webHidden/>
+              </w:rPr>
+              <w:fldChar w:fldCharType="begin"/>
+            </w:r>
+            <w:r>
+              <w:rPr>
+                <w:noProof/>
+                <w:webHidden/>
+              </w:rPr>
+              <w:instrText xml:space="preserve"> PAGEREF _Toc236832796 \h </w:instrText>
+            </w:r>
+            <w:r>
+              <w:rPr>
+                <w:noProof/>
+                <w:webHidden/>
+              </w:rPr>
+            </w:r>
+            <w:r>
+              <w:rPr>
+                <w:noProof/>
+                <w:webHidden/>
+              </w:rPr>
+              <w:fldChar w:fldCharType="separate"/>
+            </w:r>
+            <w:r>
+              <w:rPr>
+                <w:noProof/>
+                <w:webHidden/>
+              </w:rPr>
+              <w:t>2</w:t>
+            </w:r>
+            <w:r>
+              <w:rPr>
+                <w:noProof/>
+                <w:webHidden/>
+              </w:rPr>
+              <w:fldChar w:fldCharType="end"/>
+            </w:r>
+          </w:hyperlink>
+        </w:p>
+        <w:p>
+          <w:pPr>
+            <w:pStyle w:val="TOC2"/>
+            <w:tabs>
+              <w:tab w:val="right" w:leader="dot" w:pos="9350"/>
+            </w:tabs>
+            <w:rPr>
+              <w:noProof/>
+              <w:kern w:val="2"/>
+              <w:lang w:val="en-GB" w:eastAsia="en-GB"/>
+              <w14:ligatures w14:val="standardContextual"/>
+            </w:rPr>
+          </w:pPr>
+          <w:hyperlink w:anchor="_Toc236832797" w:history="1">
+            <w:r>
+              <w:rPr>
+                <w:rStyle w:val="Hyperlink"/>
+                <w:noProof/>
+              </w:rPr>
+              <w:t>5. AI-Generated Content</w:t>
+            </w:r>
+            <w:r>
+              <w:rPr>
+                <w:noProof/>
+                <w:webHidden/>
+              </w:rPr>
+              <w:tab/>
+            </w:r>
+            <w:r>
+              <w:rPr>
+                <w:noProof/>
+                <w:webHidden/>
+              </w:rPr>
+              <w:fldChar w:fldCharType="begin"/>
+            </w:r>
+            <w:r>
+              <w:rPr>
+                <w:noProof/>
+                <w:webHidden/>
+              </w:rPr>
+              <w:instrText xml:space="preserve"> PAGEREF _Toc236832797 \h </w:instrText>
+            </w:r>
+            <w:r>
+              <w:rPr>
+                <w:noProof/>
+                <w:webHidden/>
+              </w:rPr>
+            </w:r>
+            <w:r>
+              <w:rPr>
+                <w:noProof/>
+                <w:webHidden/>
+              </w:rPr>
+              <w:fldChar w:fldCharType="separate"/>
+            </w:r>
+            <w:r>
+              <w:rPr>
+                <w:noProof/>
+                <w:webHidden/>
+              </w:rPr>
+              <w:t>3</w:t>
+            </w:r>
+            <w:r>
+              <w:rPr>
+                <w:noProof/>
+                <w:webHidden/>
+              </w:rPr>
+              <w:fldChar w:fldCharType="end"/>
+            </w:r>
+          </w:hyperlink>
+        </w:p>
+        <w:p>
+          <w:pPr>
+            <w:pStyle w:val="TOC2"/>
+            <w:tabs>
+              <w:tab w:val="right" w:leader="dot" w:pos="9350"/>
+            </w:tabs>
+            <w:rPr>
+              <w:noProof/>
+              <w:kern w:val="2"/>
+              <w:lang w:val="en-GB" w:eastAsia="en-GB"/>
+              <w14:ligatures w14:val="standardContextual"/>
+            </w:rPr>
+          </w:pPr>
+          <w:hyperlink w:anchor="_Toc236832798" w:history="1">
+            <w:r>
+              <w:rPr>
+                <w:rStyle w:val="Hyperlink"/>
+                <w:noProof/>
+              </w:rPr>
+              <w:t>6. Fair Use</w:t>
+            </w:r>
+            <w:r>
+              <w:rPr>
+                <w:noProof/>
+                <w:webHidden/>
+              </w:rPr>
+              <w:tab/>
+            </w:r>
+            <w:r>
+              <w:rPr>
+                <w:noProof/>
+                <w:webHidden/>
+              </w:rPr>
+              <w:fldChar w:fldCharType="begin"/>
+            </w:r>
+            <w:r>
+              <w:rPr>
+                <w:noProof/>
+                <w:webHidden/>
+              </w:rPr>
+              <w:instrText xml:space="preserve"> PAGEREF _Toc236832798 \h </w:instrText>
+            </w:r>
+            <w:r>
+              <w:rPr>
+                <w:noProof/>
+                <w:webHidden/>
+              </w:rPr>
+            </w:r>
+            <w:r>
+              <w:rPr>
+                <w:noProof/>
+                <w:webHidden/>
+              </w:rPr>
+              <w:fldChar w:fldCharType="separate"/>
+            </w:r>
+            <w:r>
+              <w:rPr>
+                <w:noProof/>
+                <w:webHidden/>
+              </w:rPr>
+              <w:t>4</w:t>
+            </w:r>
+            <w:r>
+              <w:rPr>
+                <w:noProof/>
+                <w:webHidden/>
+              </w:rPr>
+              <w:fldChar w:fldCharType="end"/>
+            </w:r>
+          </w:hyperlink>
+        </w:p>
+        <w:p>
+          <w:pPr>
+            <w:pStyle w:val="TOC2"/>
+            <w:tabs>
+              <w:tab w:val="right" w:leader="dot" w:pos="9350"/>
+            </w:tabs>
+            <w:rPr>
+              <w:noProof/>
+              <w:kern w:val="2"/>
+              <w:lang w:val="en-GB" w:eastAsia="en-GB"/>
+              <w14:ligatures w14:val="standardContextual"/>
+            </w:rPr>
+          </w:pPr>
+          <w:hyperlink w:anchor="_Toc236832799" w:history="1">
+            <w:r>
+              <w:rPr>
+                <w:rStyle w:val="Hyperlink"/>
+                <w:noProof/>
+              </w:rPr>
+              <w:t>7. Your Content and Data</w:t>
+            </w:r>
+            <w:r>
+              <w:rPr>
+                <w:noProof/>
+                <w:webHidden/>
+              </w:rPr>
+              <w:tab/>
+            </w:r>
+            <w:r>
+              <w:rPr>
+                <w:noProof/>
+                <w:webHidden/>
+              </w:rPr>
+              <w:fldChar w:fldCharType="begin"/>
+            </w:r>
+            <w:r>
+              <w:rPr>
+                <w:noProof/>
+                <w:webHidden/>
+              </w:rPr>
+              <w:instrText xml:space="preserve"> PAGEREF _Toc236832799 \h </w:instrText>
+            </w:r>
+            <w:r>
+              <w:rPr>
+                <w:noProof/>
+                <w:webHidden/>
+              </w:rPr>
+            </w:r>
+            <w:r>
+              <w:rPr>
+                <w:noProof/>
+                <w:webHidden/>
+              </w:rPr>
+              <w:fldChar w:fldCharType="separate"/>
+            </w:r>
+            <w:r>
+              <w:rPr>
+                <w:noProof/>
+                <w:webHidden/>
+              </w:rPr>
+              <w:t>4</w:t>
+            </w:r>
+            <w:r>
+              <w:rPr>
+                <w:noProof/>
+                <w:webHidden/>
+              </w:rPr>
+              <w:fldChar w:fldCharType="end"/>
+            </w:r>
+          </w:hyperlink>
+        </w:p>
+        <w:p>
+          <w:pPr>
+            <w:pStyle w:val="TOC2"/>
+            <w:tabs>
+              <w:tab w:val="right" w:leader="dot" w:pos="9350"/>
+            </w:tabs>
+            <w:rPr>
+              <w:noProof/>
+              <w:kern w:val="2"/>
+              <w:lang w:val="en-GB" w:eastAsia="en-GB"/>
+              <w14:ligatures w14:val="standardContextual"/>
+            </w:rPr>
+          </w:pPr>
+          <w:hyperlink w:anchor="_Toc236832800" w:history="1">
+            <w:r>
+              <w:rPr>
+                <w:rStyle w:val="Hyperlink"/>
+                <w:noProof/>
+              </w:rPr>
+              <w:t>8. Intellectual Property</w:t>
+            </w:r>
+            <w:r>
+              <w:rPr>
+                <w:noProof/>
+                <w:webHidden/>
+              </w:rPr>
+              <w:tab/>
+            </w:r>
+            <w:r>
+              <w:rPr>
+                <w:noProof/>
+                <w:webHidden/>
+              </w:rPr>
+              <w:fldChar w:fldCharType="begin"/>
+            </w:r>
+            <w:r>
+              <w:rPr>
+                <w:noProof/>
+                <w:webHidden/>
+              </w:rPr>
+              <w:instrText xml:space="preserve"> PAGEREF _Toc236832800 \h </w:instrText>
+            </w:r>
+            <w:r>
+              <w:rPr>
+                <w:noProof/>
+                <w:webHidden/>
+              </w:rPr>
+            </w:r>
+            <w:r>
+              <w:rPr>
+                <w:noProof/>
+                <w:webHidden/>
+              </w:rPr>
+              <w:fldChar w:fldCharType="separate"/>
+            </w:r>
+            <w:r>
+              <w:rPr>
+                <w:noProof/>
+                <w:webHidden/>
+              </w:rPr>
+              <w:t>4</w:t>
+            </w:r>
+            <w:r>
+              <w:rPr>
+                <w:noProof/>
+                <w:webHidden/>
+              </w:rPr>
+              <w:fldChar w:fldCharType="end"/>
+            </w:r>
+          </w:hyperlink>
+        </w:p>
+        <w:p>
+          <w:pPr>
+            <w:pStyle w:val="TOC2"/>
+            <w:tabs>
+              <w:tab w:val="right" w:leader="dot" w:pos="9350"/>
+            </w:tabs>
+            <w:rPr>
+              <w:noProof/>
+              <w:kern w:val="2"/>
+              <w:lang w:val="en-GB" w:eastAsia="en-GB"/>
+              <w14:ligatures w14:val="standardContextual"/>
+            </w:rPr>
+          </w:pPr>
+          <w:hyperlink w:anchor="_Toc236832801" w:history="1">
+            <w:r>
+              <w:rPr>
+                <w:rStyle w:val="Hyperlink"/>
+                <w:noProof/>
+              </w:rPr>
+              <w:t>9. Availability and Changes to the Service</w:t>
+            </w:r>
+            <w:r>
+              <w:rPr>
+                <w:noProof/>
+                <w:webHidden/>
+              </w:rPr>
+              <w:tab/>
+            </w:r>
+            <w:r>
+              <w:rPr>
+                <w:noProof/>
+                <w:webHidden/>
+              </w:rPr>
+              <w:fldChar w:fldCharType="begin"/>
+            </w:r>
+            <w:r>
+              <w:rPr>
+                <w:noProof/>
+                <w:webHidden/>
+              </w:rPr>
+              <w:instrText xml:space="preserve"> PAGEREF _Toc236832801 \h </w:instrText>
+            </w:r>
+            <w:r>
+              <w:rPr>
+                <w:noProof/>
+                <w:webHidden/>
+              </w:rPr>
+            </w:r>
+            <w:r>
+              <w:rPr>
+                <w:noProof/>
+                <w:webHidden/>
+              </w:rPr>
+              <w:fldChar w:fldCharType="separate"/>
+            </w:r>
+            <w:r>
+              <w:rPr>
+                <w:noProof/>
+                <w:webHidden/>
+              </w:rPr>
+              <w:t>4</w:t>
+            </w:r>
+            <w:r>
+              <w:rPr>
+                <w:noProof/>
+                <w:webHidden/>
+              </w:rPr>
+              <w:fldChar w:fldCharType="end"/>
+            </w:r>
+          </w:hyperlink>
+        </w:p>
+        <w:p>
+          <w:pPr>
+            <w:pStyle w:val="TOC2"/>
+            <w:tabs>
+              <w:tab w:val="right" w:leader="dot" w:pos="9350"/>
+            </w:tabs>
+            <w:rPr>
+              <w:noProof/>
+              <w:kern w:val="2"/>
+              <w:lang w:val="en-GB" w:eastAsia="en-GB"/>
+              <w14:ligatures w14:val="standardContextual"/>
+            </w:rPr>
+          </w:pPr>
+          <w:hyperlink w:anchor="_Toc236832802" w:history="1">
+            <w:r>
+              <w:rPr>
+                <w:rStyle w:val="Hyperlink"/>
+                <w:noProof/>
+              </w:rPr>
+              <w:t>10. Limitation of Liability</w:t>
+            </w:r>
+            <w:r>
+              <w:rPr>
+                <w:noProof/>
+                <w:webHidden/>
+              </w:rPr>
+              <w:tab/>
+            </w:r>
+            <w:r>
+              <w:rPr>
+                <w:noProof/>
+                <w:webHidden/>
+              </w:rPr>
+              <w:fldChar w:fldCharType="begin"/>
+            </w:r>
+            <w:r>
+              <w:rPr>
+                <w:noProof/>
+                <w:webHidden/>
+              </w:rPr>
+              <w:instrText xml:space="preserve"> PAGEREF _Toc236832802 \h </w:instrText>
+            </w:r>
+            <w:r>
+              <w:rPr>
+                <w:noProof/>
+                <w:webHidden/>
+              </w:rPr>
+            </w:r>
+            <w:r>
+              <w:rPr>
+                <w:noProof/>
+                <w:webHidden/>
+              </w:rPr>
+              <w:fldChar w:fldCharType="separate"/>
+            </w:r>
+            <w:r>
+              <w:rPr>
+                <w:noProof/>
+                <w:webHidden/>
+              </w:rPr>
+              <w:t>5</w:t>
+            </w:r>
+            <w:r>
+              <w:rPr>
+                <w:noProof/>
+                <w:webHidden/>
+              </w:rPr>
+              <w:fldChar w:fldCharType="end"/>
+            </w:r>
+          </w:hyperlink>
+        </w:p>
+        <w:p>
+          <w:pPr>
+            <w:pStyle w:val="TOC2"/>
+            <w:tabs>
+              <w:tab w:val="right" w:leader="dot" w:pos="9350"/>
+            </w:tabs>
+            <w:rPr>
+              <w:noProof/>
+              <w:kern w:val="2"/>
+              <w:lang w:val="en-GB" w:eastAsia="en-GB"/>
+              <w14:ligatures w14:val="standardContextual"/>
+            </w:rPr>
+          </w:pPr>
+          <w:hyperlink w:anchor="_Toc236832803" w:history="1">
+            <w:r>
+              <w:rPr>
+                <w:rStyle w:val="Hyperlink"/>
+                <w:noProof/>
+              </w:rPr>
+              <w:t>11. Suspension and Termination</w:t>
+            </w:r>
+            <w:r>
+              <w:rPr>
+                <w:noProof/>
+                <w:webHidden/>
+              </w:rPr>
+              <w:tab/>
+            </w:r>
+            <w:r>
+              <w:rPr>
+                <w:noProof/>
+                <w:webHidden/>
+              </w:rPr>
+              <w:fldChar w:fldCharType="begin"/>
+            </w:r>
+            <w:r>
+              <w:rPr>
+                <w:noProof/>
+                <w:webHidden/>
+              </w:rPr>
+              <w:instrText xml:space="preserve"> PAGEREF _Toc236832803 \h </w:instrText>
+            </w:r>
+            <w:r>
+              <w:rPr>
+                <w:noProof/>
+                <w:webHidden/>
+              </w:rPr>
+            </w:r>
+            <w:r>
+              <w:rPr>
+                <w:noProof/>
+                <w:webHidden/>
+              </w:rPr>
+              <w:fldChar w:fldCharType="separate"/>
+            </w:r>
+            <w:r>
+              <w:rPr>
+                <w:noProof/>
+                <w:webHidden/>
+              </w:rPr>
+              <w:t>6</w:t>
+            </w:r>
+            <w:r>
+              <w:rPr>
+                <w:noProof/>
+                <w:webHidden/>
+              </w:rPr>
+              <w:fldChar w:fldCharType="end"/>
+            </w:r>
+          </w:hyperlink>
+        </w:p>
+        <w:p>
+          <w:pPr>
+            <w:pStyle w:val="TOC2"/>
+            <w:tabs>
+              <w:tab w:val="right" w:leader="dot" w:pos="9350"/>
+            </w:tabs>
+            <w:rPr>
+              <w:noProof/>
+              <w:kern w:val="2"/>
+              <w:lang w:val="en-GB" w:eastAsia="en-GB"/>
+              <w14:ligatures w14:val="standardContextual"/>
+            </w:rPr>
+          </w:pPr>
+          <w:hyperlink w:anchor="_Toc236832804" w:history="1">
+            <w:r>
+              <w:rPr>
+                <w:rStyle w:val="Hyperlink"/>
+                <w:noProof/>
+              </w:rPr>
+              <w:t>12. Changes to These Terms</w:t>
+            </w:r>
+            <w:r>
+              <w:rPr>
+                <w:noProof/>
+                <w:webHidden/>
+              </w:rPr>
+              <w:tab/>
+            </w:r>
+            <w:r>
+              <w:rPr>
+                <w:noProof/>
+                <w:webHidden/>
+              </w:rPr>
+              <w:fldChar w:fldCharType="begin"/>
+            </w:r>
+            <w:r>
+              <w:rPr>
+                <w:noProof/>
+                <w:webHidden/>
+              </w:rPr>
+              <w:instrText xml:space="preserve"> PAGEREF _Toc236832804 \h </w:instrText>
+            </w:r>
+            <w:r>
+              <w:rPr>
+                <w:noProof/>
+                <w:webHidden/>
+              </w:rPr>
+            </w:r>
+            <w:r>
+              <w:rPr>
+                <w:noProof/>
+                <w:webHidden/>
+              </w:rPr>
+              <w:fldChar w:fldCharType="separate"/>
+            </w:r>
+            <w:r>
+              <w:rPr>
+                <w:noProof/>
+                <w:webHidden/>
+              </w:rPr>
+              <w:t>6</w:t>
+            </w:r>
+            <w:r>
+              <w:rPr>
+                <w:noProof/>
+                <w:webHidden/>
+              </w:rPr>
+              <w:fldChar w:fldCharType="end"/>
+            </w:r>
+          </w:hyperlink>
+        </w:p>
+        <w:p>
+          <w:pPr>
+            <w:pStyle w:val="TOC2"/>
+            <w:tabs>
+              <w:tab w:val="right" w:leader="dot" w:pos="9350"/>
+            </w:tabs>
+            <w:rPr>
+              <w:noProof/>
+              <w:kern w:val="2"/>
+              <w:lang w:val="en-GB" w:eastAsia="en-GB"/>
+              <w14:ligatures w14:val="standardContextual"/>
+            </w:rPr>
+          </w:pPr>
+          <w:hyperlink w:anchor="_Toc236832805" w:history="1">
+            <w:r>
+              <w:rPr>
+                <w:rStyle w:val="Hyperlink"/>
+                <w:noProof/>
+              </w:rPr>
+              <w:t>13. Governing Law</w:t>
+            </w:r>
+            <w:r>
+              <w:rPr>
+                <w:noProof/>
+                <w:webHidden/>
+              </w:rPr>
+              <w:tab/>
+            </w:r>
+            <w:r>
+              <w:rPr>
+                <w:noProof/>
+                <w:webHidden/>
+              </w:rPr>
+              <w:fldChar w:fldCharType="begin"/>
+            </w:r>
+            <w:r>
+              <w:rPr>
+                <w:noProof/>
+                <w:webHidden/>
+              </w:rPr>
+              <w:instrText xml:space="preserve"> PAGEREF _Toc236832805 \h </w:instrText>
+            </w:r>
+            <w:r>
+              <w:rPr>
+                <w:noProof/>
+                <w:webHidden/>
+              </w:rPr>
+            </w:r>
+            <w:r>
+              <w:rPr>
+                <w:noProof/>
+                <w:webHidden/>
+              </w:rPr>
+              <w:fldChar w:fldCharType="separate"/>
+            </w:r>
+            <w:r>
+              <w:rPr>
+                <w:noProof/>
+                <w:webHidden/>
+              </w:rPr>
+              <w:t>6</w:t>
+            </w:r>
+            <w:r>
+              <w:rPr>
+                <w:noProof/>
+                <w:webHidden/>
+              </w:rPr>
+              <w:fldChar w:fldCharType="end"/>
+            </w:r>
+          </w:hyperlink>
+        </w:p>
+        <w:p>
+          <w:pPr>
+            <w:pStyle w:val="TOC2"/>
+            <w:tabs>
+              <w:tab w:val="right" w:leader="dot" w:pos="9350"/>
+            </w:tabs>
+            <w:rPr>
+              <w:noProof/>
+              <w:kern w:val="2"/>
+              <w:lang w:val="en-GB" w:eastAsia="en-GB"/>
+              <w14:ligatures w14:val="standardContextual"/>
+            </w:rPr>
+          </w:pPr>
+          <w:hyperlink w:anchor="_Toc236832806" w:history="1">
+            <w:r>
+              <w:rPr>
+                <w:rStyle w:val="Hyperlink"/>
+                <w:noProof/>
+              </w:rPr>
+              <w:t>14. Contact</w:t>
+            </w:r>
+            <w:r>
+              <w:rPr>
+                <w:noProof/>
+                <w:webHidden/>
+              </w:rPr>
+              <w:tab/>
+            </w:r>
+            <w:r>
+              <w:rPr>
+                <w:noProof/>
+                <w:webHidden/>
+              </w:rPr>
+              <w:fldChar w:fldCharType="begin"/>
+            </w:r>
+            <w:r>
+              <w:rPr>
+                <w:noProof/>
+                <w:webHidden/>
+              </w:rPr>
+              <w:instrText xml:space="preserve"> PAGEREF _Toc236832806 \h </w:instrText>
+            </w:r>
+            <w:r>
+              <w:rPr>
+                <w:noProof/>
+                <w:webHidden/>
+              </w:rPr>
+            </w:r>
+            <w:r>
+              <w:rPr>
+                <w:noProof/>
+                <w:webHidden/>
+              </w:rPr>
+              <w:fldChar w:fldCharType="separate"/>
+            </w:r>
+            <w:r>
+              <w:rPr>
+                <w:noProof/>
+                <w:webHidden/>
+              </w:rPr>
+              <w:t>6</w:t>
+            </w:r>
+            <w:r>
+              <w:rPr>
+                <w:noProof/>
+                <w:webHidden/>
+              </w:rPr>
+              <w:fldChar w:fldCharType="end"/>
+            </w:r>
+          </w:hyperlink>
+        </w:p>
+        <w:p>
+          <w:r>
+            <w:fldChar w:fldCharType="end"/>
+          </w:r>
+        </w:p>
+      </w:sdtContent>
+    </w:sdt>
     <w:p>
       <w:pPr>
         <w:pStyle w:val="Heading1"/>
       </w:pPr>
-      <w:r>
-        <w:t xml:space="preserve">Grant Pathway — Terms of Service</w:t>
-      </w:r>
+      <w:bookmarkStart w:id="0" w:name="grant-pathway-terms-of-service"/>
+      <w:bookmarkStart w:id="1" w:name="_Toc236832792"/>
+      <w:r>
+        <w:t>Grant Pathway — Terms of Service</w:t>
+      </w:r>
+      <w:bookmarkEnd w:id="1"/>
     </w:p>
     <w:p>
       <w:pPr>
@@ -20,13 +1127,10 @@
           <w:b/>
           <w:bCs/>
         </w:rPr>
-        <w:t xml:space="preserve">Version:</w:t>
-      </w:r>
-      <w:r>
-        <w:t xml:space="preserve"> </w:t>
-      </w:r>
-      <w:r>
-        <w:t xml:space="preserve">1.5</w:t>
+        <w:t>Version:</w:t>
+      </w:r>
+      <w:r>
+        <w:t xml:space="preserve"> 1.5</w:t>
       </w:r>
     </w:p>
     <w:p>
@@ -38,7 +1142,7 @@
           <w:b/>
           <w:bCs/>
         </w:rPr>
-        <w:t xml:space="preserve">Effective date: 5 August 2026</w:t>
+        <w:t>Effective date: 5 August 2026</w:t>
       </w:r>
     </w:p>
     <w:p>
@@ -50,71 +1154,43 @@
           <w:b/>
           <w:bCs/>
         </w:rPr>
-        <w:t xml:space="preserve">Last updated: 5 August 2026</w:t>
-      </w:r>
-    </w:p>
-    <w:p>
-      <w:r>
-        <w:pict>
-          <v:rect style="width:0;height:1.5pt" o:hralign="center" o:hrstd="t" o:hr="t"/>
+        <w:t>Last updated: 5 August 2026</w:t>
+      </w:r>
+    </w:p>
+    <w:p>
+      <w:r>
+        <w:pict w14:anchorId="683691A5">
+          <v:rect id="_x0000_i1025" style="width:0;height:1.5pt" o:hralign="center" o:hrstd="t" o:hr="t"/>
         </w:pict>
       </w:r>
     </w:p>
-    <w:bookmarkStart w:id="9" w:name="introduction"/>
     <w:p>
       <w:pPr>
         <w:pStyle w:val="Heading2"/>
       </w:pPr>
-      <w:r>
-        <w:t xml:space="preserve">1. Introduction</w:t>
-      </w:r>
+      <w:bookmarkStart w:id="2" w:name="introduction"/>
+      <w:bookmarkStart w:id="3" w:name="_Toc236832793"/>
+      <w:r>
+        <w:t>1. Introduction</w:t>
+      </w:r>
+      <w:bookmarkEnd w:id="3"/>
     </w:p>
     <w:p>
       <w:pPr>
         <w:pStyle w:val="FirstParagraph"/>
       </w:pPr>
       <w:r>
-        <w:t xml:space="preserve">Grant Pathway is a free online tool that helps UK charities write grant applications. It is provided by</w:t>
-      </w:r>
-      <w:r>
-        <w:t xml:space="preserve"> </w:t>
+        <w:t xml:space="preserve">Grant Pathway is a free online tool that helps UK charities write grant applications. It is provided by </w:t>
       </w:r>
       <w:r>
         <w:rPr>
           <w:b/>
           <w:bCs/>
         </w:rPr>
-        <w:t xml:space="preserve">RapidGlobe Ltd</w:t>
-      </w:r>
-      <w:r>
-        <w:t xml:space="preserve"> </w:t>
-      </w:r>
-      <w:r>
-        <w:t xml:space="preserve">(company registration number 05615649), a company registered in England and Wales at Ground Floor Suite, Crown House, 40 North Street, Hornchurch, Essex RM11 1EW (</w:t>
-      </w:r>
-      <w:r>
-        <w:t xml:space="preserve">“we”</w:t>
-      </w:r>
-      <w:r>
-        <w:t xml:space="preserve">,</w:t>
-      </w:r>
-      <w:r>
-        <w:t xml:space="preserve"> </w:t>
-      </w:r>
-      <w:r>
-        <w:t xml:space="preserve">“us”</w:t>
-      </w:r>
-      <w:r>
-        <w:t xml:space="preserve">,</w:t>
-      </w:r>
-      <w:r>
-        <w:t xml:space="preserve"> </w:t>
-      </w:r>
-      <w:r>
-        <w:t xml:space="preserve">“our”</w:t>
-      </w:r>
-      <w:r>
-        <w:t xml:space="preserve">).</w:t>
+        <w:t>RapidGlobe Ltd</w:t>
+      </w:r>
+      <w:r>
+        <w:t xml:space="preserve"> (company registration number 05615649), a company registered in England and Wales at Ground Floor Suite, Crown House, 40 North Street, Hornchurch, Essex RM11 1EW (“we”, “us”, “our”).</w:t>
       </w:r>
     </w:p>
     <w:p>
@@ -122,7 +1198,7 @@
         <w:pStyle w:val="BodyText"/>
       </w:pPr>
       <w:r>
-        <w:t xml:space="preserve">By creating an account and using Grant Pathway, you agree to be bound by these Terms of Service. Please read them carefully before you register.</w:t>
+        <w:t>By creating an account and using Grant Pathway, you agree to be bound by these Terms of Service. Please read them carefully before you register.</w:t>
       </w:r>
     </w:p>
     <w:p>
@@ -130,32 +1206,34 @@
         <w:pStyle w:val="BodyText"/>
       </w:pPr>
       <w:r>
-        <w:t xml:space="preserve">If you do not agree to these terms, you should not use the service.</w:t>
-      </w:r>
-    </w:p>
-    <w:p>
-      <w:r>
-        <w:pict>
-          <v:rect style="width:0;height:1.5pt" o:hralign="center" o:hrstd="t" o:hr="t"/>
+        <w:t>If you do not agree to these terms, you should not use the service.</w:t>
+      </w:r>
+    </w:p>
+    <w:p>
+      <w:r>
+        <w:pict w14:anchorId="107E60DA">
+          <v:rect id="_x0000_i1026" style="width:0;height:1.5pt" o:hralign="center" o:hrstd="t" o:hr="t"/>
         </w:pict>
       </w:r>
     </w:p>
-    <w:bookmarkEnd w:id="9"/>
-    <w:bookmarkStart w:id="10" w:name="who-can-use-grant-pathway"/>
     <w:p>
       <w:pPr>
         <w:pStyle w:val="Heading2"/>
       </w:pPr>
-      <w:r>
-        <w:t xml:space="preserve">2. Who Can Use Grant Pathway</w:t>
-      </w:r>
+      <w:bookmarkStart w:id="4" w:name="who-can-use-grant-pathway"/>
+      <w:bookmarkStart w:id="5" w:name="_Toc236832794"/>
+      <w:bookmarkEnd w:id="2"/>
+      <w:r>
+        <w:t>2. Who Can Use Grant Pathway</w:t>
+      </w:r>
+      <w:bookmarkEnd w:id="5"/>
     </w:p>
     <w:p>
       <w:pPr>
         <w:pStyle w:val="FirstParagraph"/>
       </w:pPr>
       <w:r>
-        <w:t xml:space="preserve">Grant Pathway is intended for charitable organisations based in or operating in the United Kingdom. To register and use the service, you must:</w:t>
+        <w:t>Grant Pathway is intended for charitable organisations based in or operating in the United Kingdom. To register and use the service, you must:</w:t>
       </w:r>
     </w:p>
     <w:p>
@@ -163,11 +1241,11 @@
         <w:pStyle w:val="Compact"/>
         <w:numPr>
           <w:ilvl w:val="0"/>
-          <w:numId w:val="1001"/>
+          <w:numId w:val="2"/>
         </w:numPr>
       </w:pPr>
       <w:r>
-        <w:t xml:space="preserve">Represent a UK-based charitable organisation — this includes registered charities, charitable incorporated organisations (CIOs), community interest companies (CICs), charitable trusts, community benefit societies, and similar bodies whose purpose is charitable or for the public benefit</w:t>
+        <w:t>Represent a UK-based charitable organisation — this includes registered charities, charitable incorporated organisations (CIOs), community interest companies (CICs), charitable trusts, community benefit societies, and similar bodies whose purpose is charitable or for the public benefit</w:t>
       </w:r>
     </w:p>
     <w:p>
@@ -175,11 +1253,11 @@
         <w:pStyle w:val="Compact"/>
         <w:numPr>
           <w:ilvl w:val="0"/>
-          <w:numId w:val="1001"/>
+          <w:numId w:val="2"/>
         </w:numPr>
       </w:pPr>
       <w:r>
-        <w:t xml:space="preserve">Be authorised by that organisation to use the service on its behalf</w:t>
+        <w:t>Be authorised by that organisation to use the service on its behalf</w:t>
       </w:r>
     </w:p>
     <w:p>
@@ -187,11 +1265,11 @@
         <w:pStyle w:val="Compact"/>
         <w:numPr>
           <w:ilvl w:val="0"/>
-          <w:numId w:val="1001"/>
+          <w:numId w:val="2"/>
         </w:numPr>
       </w:pPr>
       <w:r>
-        <w:t xml:space="preserve">Be at least 18 years old</w:t>
+        <w:t>Be at least 18 years old</w:t>
       </w:r>
     </w:p>
     <w:p>
@@ -199,7 +1277,7 @@
         <w:pStyle w:val="FirstParagraph"/>
       </w:pPr>
       <w:r>
-        <w:t xml:space="preserve">Grant Pathway is not for personal use. It is not intended for commercial fundraising. It is not for use by organisations that are not charitable in nature.</w:t>
+        <w:t>Grant Pathway is not for personal use. It is not intended for commercial fundraising. It is not for use by organisations that are not charitable in nature.</w:t>
       </w:r>
     </w:p>
     <w:p>
@@ -207,48 +1285,44 @@
         <w:pStyle w:val="BodyText"/>
       </w:pPr>
       <w:r>
-        <w:t xml:space="preserve">If you are unsure whether your organisation is eligible, please contact us at</w:t>
-      </w:r>
-      <w:r>
-        <w:t xml:space="preserve"> </w:t>
+        <w:t xml:space="preserve">If you are unsure whether your organisation is eligible, please contact us at </w:t>
       </w:r>
       <w:r>
         <w:rPr>
           <w:b/>
           <w:bCs/>
         </w:rPr>
-        <w:t xml:space="preserve">admin@rapidglobe.com</w:t>
-      </w:r>
-      <w:r>
-        <w:t xml:space="preserve"> </w:t>
-      </w:r>
-      <w:r>
-        <w:t xml:space="preserve">before registering.</w:t>
-      </w:r>
-    </w:p>
-    <w:p>
-      <w:r>
-        <w:pict>
-          <v:rect style="width:0;height:1.5pt" o:hralign="center" o:hrstd="t" o:hr="t"/>
+        <w:t>admin@rapidglobe.com</w:t>
+      </w:r>
+      <w:r>
+        <w:t xml:space="preserve"> before registering.</w:t>
+      </w:r>
+    </w:p>
+    <w:p>
+      <w:r>
+        <w:pict w14:anchorId="5B5652FA">
+          <v:rect id="_x0000_i1027" style="width:0;height:1.5pt" o:hralign="center" o:hrstd="t" o:hr="t"/>
         </w:pict>
       </w:r>
     </w:p>
-    <w:bookmarkEnd w:id="10"/>
-    <w:bookmarkStart w:id="11" w:name="your-account"/>
     <w:p>
       <w:pPr>
         <w:pStyle w:val="Heading2"/>
       </w:pPr>
-      <w:r>
-        <w:t xml:space="preserve">3. Your Account</w:t>
-      </w:r>
+      <w:bookmarkStart w:id="6" w:name="your-account"/>
+      <w:bookmarkStart w:id="7" w:name="_Toc236832795"/>
+      <w:bookmarkEnd w:id="4"/>
+      <w:r>
+        <w:t>3. Your Account</w:t>
+      </w:r>
+      <w:bookmarkEnd w:id="7"/>
     </w:p>
     <w:p>
       <w:pPr>
         <w:pStyle w:val="FirstParagraph"/>
       </w:pPr>
       <w:r>
-        <w:t xml:space="preserve">When you register, you create a personal account linked to your email address. You are responsible for:</w:t>
+        <w:t>When you register, you create a personal account linked to your email address. You are responsible for:</w:t>
       </w:r>
     </w:p>
     <w:p>
@@ -256,11 +1330,11 @@
         <w:pStyle w:val="Compact"/>
         <w:numPr>
           <w:ilvl w:val="0"/>
-          <w:numId w:val="1002"/>
+          <w:numId w:val="3"/>
         </w:numPr>
       </w:pPr>
       <w:r>
-        <w:t xml:space="preserve">Keeping your login credentials secure and confidential</w:t>
+        <w:t>Keeping your login credentials secure and confidential</w:t>
       </w:r>
     </w:p>
     <w:p>
@@ -268,11 +1342,11 @@
         <w:pStyle w:val="Compact"/>
         <w:numPr>
           <w:ilvl w:val="0"/>
-          <w:numId w:val="1002"/>
+          <w:numId w:val="3"/>
         </w:numPr>
       </w:pPr>
       <w:r>
-        <w:t xml:space="preserve">All activity that takes place under your account</w:t>
+        <w:t>All activity that takes place under your account</w:t>
       </w:r>
     </w:p>
     <w:p>
@@ -280,11 +1354,11 @@
         <w:pStyle w:val="Compact"/>
         <w:numPr>
           <w:ilvl w:val="0"/>
-          <w:numId w:val="1002"/>
+          <w:numId w:val="3"/>
         </w:numPr>
       </w:pPr>
       <w:r>
-        <w:t xml:space="preserve">Ensuring that the information in your organisation profile is accurate and kept up to date</w:t>
+        <w:t>Ensuring that the information in your organisation profile is accurate and kept up to date</w:t>
       </w:r>
     </w:p>
     <w:p>
@@ -292,20 +1366,17 @@
         <w:pStyle w:val="FirstParagraph"/>
       </w:pPr>
       <w:r>
-        <w:t xml:space="preserve">If you believe your account has been accessed without your authorisation, contact us immediately at</w:t>
-      </w:r>
-      <w:r>
-        <w:t xml:space="preserve"> </w:t>
+        <w:t xml:space="preserve">If you believe your account has been accessed without your authorisation, contact us immediately at </w:t>
       </w:r>
       <w:r>
         <w:rPr>
           <w:b/>
           <w:bCs/>
         </w:rPr>
-        <w:t xml:space="preserve">admin@rapidglobe.com</w:t>
-      </w:r>
-      <w:r>
-        <w:t xml:space="preserve">.</w:t>
+        <w:t>admin@rapidglobe.com</w:t>
+      </w:r>
+      <w:r>
+        <w:t>.</w:t>
       </w:r>
     </w:p>
     <w:p>
@@ -313,32 +1384,34 @@
         <w:pStyle w:val="BodyText"/>
       </w:pPr>
       <w:r>
-        <w:t xml:space="preserve">You may only hold one account per person. You may not share your account with other individuals. You may not create multiple accounts to circumvent the fair-use limit or any other restriction.</w:t>
-      </w:r>
-    </w:p>
-    <w:p>
-      <w:r>
-        <w:pict>
-          <v:rect style="width:0;height:1.5pt" o:hralign="center" o:hrstd="t" o:hr="t"/>
+        <w:t>You may only hold one account per person. You may not share your account with other individuals. You may not create multiple accounts to circumvent the fair-use limit or any other restriction.</w:t>
+      </w:r>
+    </w:p>
+    <w:p>
+      <w:r>
+        <w:pict w14:anchorId="19BA1B1D">
+          <v:rect id="_x0000_i1028" style="width:0;height:1.5pt" o:hralign="center" o:hrstd="t" o:hr="t"/>
         </w:pict>
       </w:r>
     </w:p>
-    <w:bookmarkEnd w:id="11"/>
-    <w:bookmarkStart w:id="12" w:name="using-the-service"/>
     <w:p>
       <w:pPr>
         <w:pStyle w:val="Heading2"/>
       </w:pPr>
-      <w:r>
-        <w:t xml:space="preserve">4. Using the Service</w:t>
-      </w:r>
+      <w:bookmarkStart w:id="8" w:name="using-the-service"/>
+      <w:bookmarkStart w:id="9" w:name="_Toc236832796"/>
+      <w:bookmarkEnd w:id="6"/>
+      <w:r>
+        <w:t>4. Using the Service</w:t>
+      </w:r>
+      <w:bookmarkEnd w:id="9"/>
     </w:p>
     <w:p>
       <w:pPr>
         <w:pStyle w:val="FirstParagraph"/>
       </w:pPr>
       <w:r>
-        <w:t xml:space="preserve">You agree to use Grant Pathway only for its intended purpose: supporting your charitable organisation in writing grant applications.</w:t>
+        <w:t>You agree to use Grant Pathway only for its intended purpose: supporting your charitable organisation in writing grant applications.</w:t>
       </w:r>
     </w:p>
     <w:p>
@@ -346,7 +1419,7 @@
         <w:pStyle w:val="BodyText"/>
       </w:pPr>
       <w:r>
-        <w:t xml:space="preserve">You must not:</w:t>
+        <w:t>You must not:</w:t>
       </w:r>
     </w:p>
     <w:p>
@@ -354,11 +1427,11 @@
         <w:pStyle w:val="Compact"/>
         <w:numPr>
           <w:ilvl w:val="0"/>
-          <w:numId w:val="1003"/>
+          <w:numId w:val="4"/>
         </w:numPr>
       </w:pPr>
       <w:r>
-        <w:t xml:space="preserve">Use the service for any unlawful purpose or in breach of any applicable law or regulation</w:t>
+        <w:t>Use the service for any unlawful purpose or in breach of any applicable law or regulation</w:t>
       </w:r>
     </w:p>
     <w:p>
@@ -366,11 +1439,11 @@
         <w:pStyle w:val="Compact"/>
         <w:numPr>
           <w:ilvl w:val="0"/>
-          <w:numId w:val="1003"/>
+          <w:numId w:val="4"/>
         </w:numPr>
       </w:pPr>
       <w:r>
-        <w:t xml:space="preserve">Submit false or misleading information about your organisation or its work</w:t>
+        <w:t>Submit false or misleading information about your organisation or its work</w:t>
       </w:r>
     </w:p>
     <w:p>
@@ -378,11 +1451,11 @@
         <w:pStyle w:val="Compact"/>
         <w:numPr>
           <w:ilvl w:val="0"/>
-          <w:numId w:val="1003"/>
+          <w:numId w:val="4"/>
         </w:numPr>
       </w:pPr>
       <w:r>
-        <w:t xml:space="preserve">Attempt to gain unauthorised access to the service, its systems, or other users’ accounts</w:t>
+        <w:t>Attempt to gain unauthorised access to the service, its systems, or other users’ accounts</w:t>
       </w:r>
     </w:p>
     <w:p>
@@ -390,11 +1463,11 @@
         <w:pStyle w:val="Compact"/>
         <w:numPr>
           <w:ilvl w:val="0"/>
-          <w:numId w:val="1003"/>
+          <w:numId w:val="4"/>
         </w:numPr>
       </w:pPr>
       <w:r>
-        <w:t xml:space="preserve">Use the service to generate or distribute content that is unlawful, defamatory, discriminatory, or harmful</w:t>
+        <w:t>Use the service to generate or distribute content that is unlawful, defamatory, discriminatory, or harmful</w:t>
       </w:r>
     </w:p>
     <w:p>
@@ -402,11 +1475,11 @@
         <w:pStyle w:val="Compact"/>
         <w:numPr>
           <w:ilvl w:val="0"/>
-          <w:numId w:val="1003"/>
+          <w:numId w:val="4"/>
         </w:numPr>
       </w:pPr>
       <w:r>
-        <w:t xml:space="preserve">Interfere with the service or place an unreasonable burden on our infrastructure in a way that disrupts access for other users</w:t>
+        <w:t>Interfere with the service or place an unreasonable burden on our infrastructure in a way that disrupts access for other users</w:t>
       </w:r>
     </w:p>
     <w:p>
@@ -414,11 +1487,11 @@
         <w:pStyle w:val="Compact"/>
         <w:numPr>
           <w:ilvl w:val="0"/>
-          <w:numId w:val="1003"/>
+          <w:numId w:val="4"/>
         </w:numPr>
       </w:pPr>
       <w:r>
-        <w:t xml:space="preserve">Attempt to reverse engineer, decompile, or extract the source code of any proprietary components of the service</w:t>
+        <w:t>Attempt to reverse engineer, decompile, or extract the source code of any proprietary components of the service</w:t>
       </w:r>
     </w:p>
     <w:p>
@@ -426,32 +1499,34 @@
         <w:pStyle w:val="FirstParagraph"/>
       </w:pPr>
       <w:r>
-        <w:t xml:space="preserve">We reserve the right to suspend or terminate accounts that violate these terms (see Section 11).</w:t>
-      </w:r>
-    </w:p>
-    <w:p>
-      <w:r>
-        <w:pict>
-          <v:rect style="width:0;height:1.5pt" o:hralign="center" o:hrstd="t" o:hr="t"/>
+        <w:t>We reserve the right to suspend or terminate accounts that violate these terms (see Section 11).</w:t>
+      </w:r>
+    </w:p>
+    <w:p>
+      <w:r>
+        <w:pict w14:anchorId="13AED64B">
+          <v:rect id="_x0000_i1029" style="width:0;height:1.5pt" o:hralign="center" o:hrstd="t" o:hr="t"/>
         </w:pict>
       </w:r>
     </w:p>
-    <w:bookmarkEnd w:id="12"/>
-    <w:bookmarkStart w:id="13" w:name="ai-generated-content"/>
     <w:p>
       <w:pPr>
         <w:pStyle w:val="Heading2"/>
       </w:pPr>
-      <w:r>
-        <w:t xml:space="preserve">5. AI-Generated Content</w:t>
-      </w:r>
+      <w:bookmarkStart w:id="10" w:name="ai-generated-content"/>
+      <w:bookmarkStart w:id="11" w:name="_Toc236832797"/>
+      <w:bookmarkEnd w:id="8"/>
+      <w:r>
+        <w:t>5. AI-Generated Content</w:t>
+      </w:r>
+      <w:bookmarkEnd w:id="11"/>
     </w:p>
     <w:p>
       <w:pPr>
         <w:pStyle w:val="FirstParagraph"/>
       </w:pPr>
       <w:r>
-        <w:t xml:space="preserve">Grant Pathway uses artificial intelligence to summarise funder guidelines and, on request, help you refine and improve the answers you write to application questions. You write every answer yourself — the AI does not generate answers from scratch. This is designed to support your writing — not to replace your judgement.</w:t>
+        <w:t>Grant Pathway uses artificial intelligence to summarise funder guidelines and, on request, help you refine and improve the answers you write to application questions. You write every answer yourself — the AI does not generate answers from scratch. This is designed to support your writing — not to replace your judgement.</w:t>
       </w:r>
     </w:p>
     <w:p>
@@ -459,7 +1534,7 @@
         <w:pStyle w:val="BodyText"/>
       </w:pPr>
       <w:r>
-        <w:t xml:space="preserve">Before any AI-generated content is saved to your application, you are asked to confirm that:</w:t>
+        <w:t>Before any AI-generated content is saved to your application, you are asked to confirm that:</w:t>
       </w:r>
     </w:p>
     <w:p>
@@ -467,11 +1542,11 @@
         <w:pStyle w:val="Compact"/>
         <w:numPr>
           <w:ilvl w:val="0"/>
-          <w:numId w:val="1004"/>
+          <w:numId w:val="5"/>
         </w:numPr>
       </w:pPr>
       <w:r>
-        <w:t xml:space="preserve">It accurately describes your charity and project</w:t>
+        <w:t>It accurately describes your charity and project</w:t>
       </w:r>
     </w:p>
     <w:p>
@@ -479,11 +1554,11 @@
         <w:pStyle w:val="Compact"/>
         <w:numPr>
           <w:ilvl w:val="0"/>
-          <w:numId w:val="1004"/>
+          <w:numId w:val="5"/>
         </w:numPr>
       </w:pPr>
       <w:r>
-        <w:t xml:space="preserve">All figures, dates, and facts are correct</w:t>
+        <w:t>All figures, dates, and facts are correct</w:t>
       </w:r>
     </w:p>
     <w:p>
@@ -491,11 +1566,11 @@
         <w:pStyle w:val="Compact"/>
         <w:numPr>
           <w:ilvl w:val="0"/>
-          <w:numId w:val="1004"/>
+          <w:numId w:val="5"/>
         </w:numPr>
       </w:pPr>
       <w:r>
-        <w:t xml:space="preserve">It answers the question that was asked</w:t>
+        <w:t>It answers the question that was asked</w:t>
       </w:r>
     </w:p>
     <w:p>
@@ -507,13 +1582,10 @@
           <w:b/>
           <w:bCs/>
         </w:rPr>
-        <w:t xml:space="preserve">You are responsible for all content you submit in a grant application.</w:t>
-      </w:r>
-      <w:r>
-        <w:t xml:space="preserve"> </w:t>
-      </w:r>
-      <w:r>
-        <w:t xml:space="preserve">You write every answer. If you ask for help, Grant Pathway suggests an improved version of what you have already written — it does not create an answer from nothing. You decide whether to use the suggestion, edit it, or discard it entirely. We do not review your applications. We do not submit applications on your behalf.</w:t>
+        <w:t>You are responsible for all content you submit in a grant application.</w:t>
+      </w:r>
+      <w:r>
+        <w:t xml:space="preserve"> You write every answer. If you ask for help, Grant Pathway suggests an improved version of what you have already written — it does not create an answer from nothing. You decide whether to use the suggestion, edit it, or discard it entirely. We do not review your applications. We do not submit applications on your behalf.</w:t>
       </w:r>
     </w:p>
     <w:p>
@@ -521,7 +1593,7 @@
         <w:pStyle w:val="BodyText"/>
       </w:pPr>
       <w:r>
-        <w:t xml:space="preserve">We make no representation that using Grant Pathway will result in a successful grant application. Funding decisions rest entirely with the relevant funder.</w:t>
+        <w:t>We make no representation that using Grant Pathway will result in a successful grant application. Funding decisions rest entirely with the relevant funder.</w:t>
       </w:r>
     </w:p>
     <w:p>
@@ -529,61 +1601,54 @@
         <w:pStyle w:val="BodyText"/>
       </w:pPr>
       <w:r>
-        <w:t xml:space="preserve">The AI features are powered by the Anthropic Claude model, accessed via Amazon Web Services’ Bedrock service (eu-west-2, London). When you request a summary, or ask for help improving an answer you have written, the relevant content from your funder guidelines and organisation profile is processed within UK and European Economic Area infrastructure. Please see our</w:t>
-      </w:r>
-      <w:r>
-        <w:t xml:space="preserve"> </w:t>
+        <w:t xml:space="preserve">The AI features are powered by the Anthropic Claude model, accessed via Amazon Web Services’ Bedrock service (eu-west-2, London). When you request a summary, or ask for help improving an answer you have written, the relevant content from your funder guidelines and organisation profile is processed within UK and European Economic Area infrastructure. Please see our </w:t>
       </w:r>
       <w:r>
         <w:rPr>
           <w:b/>
           <w:bCs/>
         </w:rPr>
-        <w:t xml:space="preserve">Privacy Policy</w:t>
-      </w:r>
-      <w:r>
-        <w:t xml:space="preserve"> </w:t>
-      </w:r>
-      <w:r>
-        <w:t xml:space="preserve">for full details of how your data is handled in this process.</w:t>
-      </w:r>
-    </w:p>
-    <w:p>
-      <w:r>
-        <w:pict>
-          <v:rect style="width:0;height:1.5pt" o:hralign="center" o:hrstd="t" o:hr="t"/>
+        <w:t>Privacy Policy</w:t>
+      </w:r>
+      <w:r>
+        <w:t xml:space="preserve"> for full details of how your data is handled in this process.</w:t>
+      </w:r>
+    </w:p>
+    <w:p>
+      <w:r>
+        <w:pict w14:anchorId="355FBBE9">
+          <v:rect id="_x0000_i1030" style="width:0;height:1.5pt" o:hralign="center" o:hrstd="t" o:hr="t"/>
         </w:pict>
       </w:r>
     </w:p>
-    <w:bookmarkEnd w:id="13"/>
-    <w:bookmarkStart w:id="14" w:name="fair-use"/>
     <w:p>
       <w:pPr>
         <w:pStyle w:val="Heading2"/>
       </w:pPr>
-      <w:r>
-        <w:t xml:space="preserve">6. Fair Use</w:t>
-      </w:r>
+      <w:bookmarkStart w:id="12" w:name="fair-use"/>
+      <w:bookmarkStart w:id="13" w:name="_Toc236832798"/>
+      <w:bookmarkEnd w:id="10"/>
+      <w:r>
+        <w:t>6. Fair Use</w:t>
+      </w:r>
+      <w:bookmarkEnd w:id="13"/>
     </w:p>
     <w:p>
       <w:pPr>
         <w:pStyle w:val="FirstParagraph"/>
       </w:pPr>
       <w:r>
-        <w:t xml:space="preserve">Grant Pathway is free to use. To manage the running costs of the AI features and ensure fair access for all users, each account is subject to a</w:t>
-      </w:r>
-      <w:r>
-        <w:t xml:space="preserve"> </w:t>
+        <w:t xml:space="preserve">Grant Pathway is free to use. To manage the running costs of the AI features and ensure fair access for all users, each account is subject to a </w:t>
       </w:r>
       <w:r>
         <w:rPr>
           <w:b/>
           <w:bCs/>
         </w:rPr>
-        <w:t xml:space="preserve">fair-use limit of 50 AI-assisted requests per calendar month</w:t>
-      </w:r>
-      <w:r>
-        <w:t xml:space="preserve">.</w:t>
+        <w:t>fair-use limit of 50 AI-assisted requests per calendar month</w:t>
+      </w:r>
+      <w:r>
+        <w:t>.</w:t>
       </w:r>
     </w:p>
     <w:p>
@@ -591,7 +1656,7 @@
         <w:pStyle w:val="BodyText"/>
       </w:pPr>
       <w:r>
-        <w:t xml:space="preserve">This limit is intended to accommodate the realistic needs of a small charity writing grant applications throughout the year. The limit resets at the start of each calendar month.</w:t>
+        <w:t>This limit is intended to accommodate the realistic needs of a small charity writing grant applications throughout the year. The limit resets at the start of each calendar month.</w:t>
       </w:r>
     </w:p>
     <w:p>
@@ -599,45 +1664,44 @@
         <w:pStyle w:val="BodyText"/>
       </w:pPr>
       <w:r>
-        <w:t xml:space="preserve">If you believe the limit is preventing you from using the service reasonably, please contact us at</w:t>
-      </w:r>
-      <w:r>
-        <w:t xml:space="preserve"> </w:t>
+        <w:t xml:space="preserve">If you believe the limit is preventing you from using the service reasonably, please contact us at </w:t>
       </w:r>
       <w:r>
         <w:rPr>
           <w:b/>
           <w:bCs/>
         </w:rPr>
-        <w:t xml:space="preserve">admin@rapidglobe.com</w:t>
-      </w:r>
-      <w:r>
-        <w:t xml:space="preserve">.</w:t>
-      </w:r>
-    </w:p>
-    <w:p>
-      <w:r>
-        <w:pict>
-          <v:rect style="width:0;height:1.5pt" o:hralign="center" o:hrstd="t" o:hr="t"/>
+        <w:t>admin@rapidglobe.com</w:t>
+      </w:r>
+      <w:r>
+        <w:t>.</w:t>
+      </w:r>
+    </w:p>
+    <w:p>
+      <w:r>
+        <w:pict w14:anchorId="34B8AA1E">
+          <v:rect id="_x0000_i1031" style="width:0;height:1.5pt" o:hralign="center" o:hrstd="t" o:hr="t"/>
         </w:pict>
       </w:r>
     </w:p>
-    <w:bookmarkEnd w:id="14"/>
-    <w:bookmarkStart w:id="15" w:name="your-content-and-data"/>
     <w:p>
       <w:pPr>
         <w:pStyle w:val="Heading2"/>
       </w:pPr>
-      <w:r>
-        <w:t xml:space="preserve">7. Your Content and Data</w:t>
-      </w:r>
+      <w:bookmarkStart w:id="14" w:name="your-content-and-data"/>
+      <w:bookmarkStart w:id="15" w:name="_Toc236832799"/>
+      <w:bookmarkEnd w:id="12"/>
+      <w:r>
+        <w:t>7. Your Content and Data</w:t>
+      </w:r>
+      <w:bookmarkEnd w:id="15"/>
     </w:p>
     <w:p>
       <w:pPr>
         <w:pStyle w:val="FirstParagraph"/>
       </w:pPr>
       <w:r>
-        <w:t xml:space="preserve">You retain ownership of all content you create or upload through Grant Pathway — including your organisation profile, any funder guidelines you upload, and the application content you work on.</w:t>
+        <w:t>You retain ownership of all content you create or upload through Grant Pathway — including your organisation profile, any funder guidelines you upload, and the application content you work on.</w:t>
       </w:r>
     </w:p>
     <w:p>
@@ -645,7 +1709,7 @@
         <w:pStyle w:val="BodyText"/>
       </w:pPr>
       <w:r>
-        <w:t xml:space="preserve">By using the service, you grant RapidGlobe Ltd a limited, non-exclusive licence to store, process, and use that content solely to provide the service to you. This licence ends when you delete the relevant content or close your account.</w:t>
+        <w:t>By using the service, you grant RapidGlobe Ltd a limited, non-exclusive licence to store, process, and use that content solely to provide the service to you. This licence ends when you delete the relevant content or close your account.</w:t>
       </w:r>
     </w:p>
     <w:p>
@@ -653,7 +1717,7 @@
         <w:pStyle w:val="BodyText"/>
       </w:pPr>
       <w:r>
-        <w:t xml:space="preserve">We do not use your content to train artificial intelligence models. We do not share it with third parties for commercial purposes.</w:t>
+        <w:t>We do not use your content to train artificial intelligence models. We do not share it with third parties for commercial purposes.</w:t>
       </w:r>
     </w:p>
     <w:p>
@@ -661,45 +1725,44 @@
         <w:pStyle w:val="BodyText"/>
       </w:pPr>
       <w:r>
-        <w:t xml:space="preserve">For full details of how we handle your data, please read our</w:t>
-      </w:r>
-      <w:r>
-        <w:t xml:space="preserve"> </w:t>
+        <w:t xml:space="preserve">For full details of how we handle your data, please read our </w:t>
       </w:r>
       <w:r>
         <w:rPr>
           <w:b/>
           <w:bCs/>
         </w:rPr>
-        <w:t xml:space="preserve">Privacy Policy</w:t>
-      </w:r>
-      <w:r>
-        <w:t xml:space="preserve">.</w:t>
-      </w:r>
-    </w:p>
-    <w:p>
-      <w:r>
-        <w:pict>
-          <v:rect style="width:0;height:1.5pt" o:hralign="center" o:hrstd="t" o:hr="t"/>
+        <w:t>Privacy Policy</w:t>
+      </w:r>
+      <w:r>
+        <w:t>.</w:t>
+      </w:r>
+    </w:p>
+    <w:p>
+      <w:r>
+        <w:pict w14:anchorId="2B631DE3">
+          <v:rect id="_x0000_i1032" style="width:0;height:1.5pt" o:hralign="center" o:hrstd="t" o:hr="t"/>
         </w:pict>
       </w:r>
     </w:p>
-    <w:bookmarkEnd w:id="15"/>
-    <w:bookmarkStart w:id="16" w:name="intellectual-property"/>
     <w:p>
       <w:pPr>
         <w:pStyle w:val="Heading2"/>
       </w:pPr>
-      <w:r>
-        <w:t xml:space="preserve">8. Intellectual Property</w:t>
-      </w:r>
+      <w:bookmarkStart w:id="16" w:name="intellectual-property"/>
+      <w:bookmarkStart w:id="17" w:name="_Toc236832800"/>
+      <w:bookmarkEnd w:id="14"/>
+      <w:r>
+        <w:t>8. Intellectual Property</w:t>
+      </w:r>
+      <w:bookmarkEnd w:id="17"/>
     </w:p>
     <w:p>
       <w:pPr>
         <w:pStyle w:val="FirstParagraph"/>
       </w:pPr>
       <w:r>
-        <w:t xml:space="preserve">Grant Pathway’s source code is proprietary and closed source. All rights are reserved by RapidGlobe Ltd; the source code is not publicly available and may not be used, copied, modified, or distributed without our prior written permission.</w:t>
+        <w:t>Grant Pathway’s source code is proprietary and closed source. All rights are reserved by RapidGlobe Ltd; the source code is not publicly available and may not be used, copied, modified, or distributed without our prior written permission.</w:t>
       </w:r>
     </w:p>
     <w:p>
@@ -707,32 +1770,34 @@
         <w:pStyle w:val="BodyText"/>
       </w:pPr>
       <w:r>
-        <w:t xml:space="preserve">The Grant Pathway name, logo, and brand materials are owned by RapidGlobe Ltd. You may not use them without our prior written permission.</w:t>
-      </w:r>
-    </w:p>
-    <w:p>
-      <w:r>
-        <w:pict>
-          <v:rect style="width:0;height:1.5pt" o:hralign="center" o:hrstd="t" o:hr="t"/>
+        <w:t>The Grant Pathway name, logo, and brand materials are owned by RapidGlobe Ltd. You may not use them without our prior written permission.</w:t>
+      </w:r>
+    </w:p>
+    <w:p>
+      <w:r>
+        <w:pict w14:anchorId="147E50E7">
+          <v:rect id="_x0000_i1033" style="width:0;height:1.5pt" o:hralign="center" o:hrstd="t" o:hr="t"/>
         </w:pict>
       </w:r>
     </w:p>
-    <w:bookmarkEnd w:id="16"/>
-    <w:bookmarkStart w:id="17" w:name="availability-and-changes-to-the-service"/>
     <w:p>
       <w:pPr>
         <w:pStyle w:val="Heading2"/>
       </w:pPr>
-      <w:r>
-        <w:t xml:space="preserve">9. Availability and Changes to the Service</w:t>
-      </w:r>
+      <w:bookmarkStart w:id="18" w:name="availability-and-changes-to-the-service"/>
+      <w:bookmarkStart w:id="19" w:name="_Toc236832801"/>
+      <w:bookmarkEnd w:id="16"/>
+      <w:r>
+        <w:t>9. Availability and Changes to the Service</w:t>
+      </w:r>
+      <w:bookmarkEnd w:id="19"/>
     </w:p>
     <w:p>
       <w:pPr>
         <w:pStyle w:val="FirstParagraph"/>
       </w:pPr>
       <w:r>
-        <w:t xml:space="preserve">We aim to keep Grant Pathway available at all times, but we do not guarantee uninterrupted access. The service may be temporarily unavailable due to planned maintenance, technical issues, or circumstances outside our control.</w:t>
+        <w:t>We aim to keep Grant Pathway available at all times, but we do not guarantee uninterrupted access. The service may be temporarily unavailable due to planned maintenance, technical issues, or circumstances outside our control.</w:t>
       </w:r>
     </w:p>
     <w:p>
@@ -740,7 +1805,7 @@
         <w:pStyle w:val="BodyText"/>
       </w:pPr>
       <w:r>
-        <w:t xml:space="preserve">We maintain operational backup infrastructure (automated daily database backups) as a safeguard against technical failures, security incidents, and provider outages. This is an internal operational measure. It does not constitute a guarantee that data can or will be recovered in any particular circumstance, and it does not entitle users to request restoration of previously deleted or lost data.</w:t>
+        <w:t>We maintain operational backup infrastructure (automated daily database backups) as a safeguard against technical failures, security incidents, and provider outages. This is an internal operational measure. It does not constitute a guarantee that data can or will be recovered in any particular circumstance, and it does not entitle users to request restoration of previously deleted or lost data.</w:t>
       </w:r>
     </w:p>
     <w:p>
@@ -748,7 +1813,7 @@
         <w:pStyle w:val="BodyText"/>
       </w:pPr>
       <w:r>
-        <w:t xml:space="preserve">We reserve the right to:</w:t>
+        <w:t>We reserve the right to:</w:t>
       </w:r>
     </w:p>
     <w:p>
@@ -756,11 +1821,11 @@
         <w:pStyle w:val="Compact"/>
         <w:numPr>
           <w:ilvl w:val="0"/>
-          <w:numId w:val="1005"/>
+          <w:numId w:val="6"/>
         </w:numPr>
       </w:pPr>
       <w:r>
-        <w:t xml:space="preserve">Modify, update, or remove features of the service at any time</w:t>
+        <w:t>Modify, update, or remove features of the service at any time</w:t>
       </w:r>
     </w:p>
     <w:p>
@@ -768,11 +1833,11 @@
         <w:pStyle w:val="Compact"/>
         <w:numPr>
           <w:ilvl w:val="0"/>
-          <w:numId w:val="1005"/>
+          <w:numId w:val="6"/>
         </w:numPr>
       </w:pPr>
       <w:r>
-        <w:t xml:space="preserve">Suspend the service temporarily for maintenance or technical reasons</w:t>
+        <w:t>Suspend the service temporarily for maintenance or technical reasons</w:t>
       </w:r>
     </w:p>
     <w:p>
@@ -780,11 +1845,11 @@
         <w:pStyle w:val="Compact"/>
         <w:numPr>
           <w:ilvl w:val="0"/>
-          <w:numId w:val="1005"/>
+          <w:numId w:val="6"/>
         </w:numPr>
       </w:pPr>
       <w:r>
-        <w:t xml:space="preserve">Discontinue the service entirely</w:t>
+        <w:t>Discontinue the service entirely</w:t>
       </w:r>
     </w:p>
     <w:p>
@@ -792,44 +1857,37 @@
         <w:pStyle w:val="FirstParagraph"/>
       </w:pPr>
       <w:r>
-        <w:t xml:space="preserve">If we decide to discontinue the service permanently, we will give reasonable advance notice and ensure that users have the opportunity to export their data before the service closes.</w:t>
-      </w:r>
-    </w:p>
-    <w:p>
-      <w:r>
-        <w:pict>
-          <v:rect style="width:0;height:1.5pt" o:hralign="center" o:hrstd="t" o:hr="t"/>
+        <w:t>If we decide to discontinue the service permanently, we will give reasonable advance notice and ensure that users have the opportunity to export their data before the service closes.</w:t>
+      </w:r>
+    </w:p>
+    <w:p>
+      <w:r>
+        <w:pict w14:anchorId="4CF273AD">
+          <v:rect id="_x0000_i1034" style="width:0;height:1.5pt" o:hralign="center" o:hrstd="t" o:hr="t"/>
         </w:pict>
       </w:r>
     </w:p>
-    <w:bookmarkEnd w:id="17"/>
-    <w:bookmarkStart w:id="18" w:name="limitation-of-liability"/>
     <w:p>
       <w:pPr>
         <w:pStyle w:val="Heading2"/>
       </w:pPr>
-      <w:r>
-        <w:t xml:space="preserve">10. Limitation of Liability</w:t>
-      </w:r>
+      <w:bookmarkStart w:id="20" w:name="limitation-of-liability"/>
+      <w:bookmarkStart w:id="21" w:name="_Toc236832802"/>
+      <w:bookmarkEnd w:id="18"/>
+      <w:r>
+        <w:t>10. Limitation of Liability</w:t>
+      </w:r>
+      <w:bookmarkEnd w:id="21"/>
     </w:p>
     <w:p>
       <w:pPr>
         <w:pStyle w:val="FirstParagraph"/>
       </w:pPr>
       <w:r>
-        <w:t xml:space="preserve">Grant Pathway is provided free of charge and on an</w:t>
-      </w:r>
-      <w:r>
-        <w:t xml:space="preserve"> </w:t>
-      </w:r>
-      <w:r>
-        <w:t xml:space="preserve">“as is”</w:t>
-      </w:r>
-      <w:r>
-        <w:t xml:space="preserve"> </w:t>
-      </w:r>
-      <w:r>
-        <w:t xml:space="preserve">basis. To the fullest extent permitted by applicable law, RapidGlobe Ltd excludes all warranties, express or implied, including any warranty that the service will be uninterrupted, error-free, or that AI-generated content will be accurate or suitable for any particular purpose.</w:t>
+        <w:t xml:space="preserve">Grant Pathway is provided free of charge and on an “as is” </w:t>
+      </w:r>
+      <w:r>
+        <w:t>basis. To the fullest extent permitted by applicable law, RapidGlobe Ltd excludes all warranties, express or implied, including any warranty that the service will be uninterrupted, error-free, or that AI-generated content will be accurate or suitable for any particular purpose.</w:t>
       </w:r>
     </w:p>
     <w:p>
@@ -837,7 +1895,7 @@
         <w:pStyle w:val="BodyText"/>
       </w:pPr>
       <w:r>
-        <w:t xml:space="preserve">To the fullest extent permitted by law, RapidGlobe Ltd shall not be liable for:</w:t>
+        <w:t>To the fullest extent permitted by law, RapidGlobe Ltd shall not be liable for:</w:t>
       </w:r>
     </w:p>
     <w:p>
@@ -845,11 +1903,11 @@
         <w:pStyle w:val="Compact"/>
         <w:numPr>
           <w:ilvl w:val="0"/>
-          <w:numId w:val="1006"/>
+          <w:numId w:val="7"/>
         </w:numPr>
       </w:pPr>
       <w:r>
-        <w:t xml:space="preserve">Loss of funding or missed grant opportunities arising from use of the service</w:t>
+        <w:t>Loss of funding or missed grant opportunities arising from use of the service</w:t>
       </w:r>
     </w:p>
     <w:p>
@@ -857,11 +1915,11 @@
         <w:pStyle w:val="Compact"/>
         <w:numPr>
           <w:ilvl w:val="0"/>
-          <w:numId w:val="1006"/>
+          <w:numId w:val="7"/>
         </w:numPr>
       </w:pPr>
       <w:r>
-        <w:t xml:space="preserve">Errors, inaccuracies, or omissions in AI-generated content</w:t>
+        <w:t>Errors, inaccuracies, or omissions in AI-generated content</w:t>
       </w:r>
     </w:p>
     <w:p>
@@ -869,11 +1927,11 @@
         <w:pStyle w:val="Compact"/>
         <w:numPr>
           <w:ilvl w:val="0"/>
-          <w:numId w:val="1006"/>
+          <w:numId w:val="7"/>
         </w:numPr>
       </w:pPr>
       <w:r>
-        <w:t xml:space="preserve">Loss or corruption of data (other than where caused by our negligence)</w:t>
+        <w:t>Loss or corruption of data (other than where caused by our negligence)</w:t>
       </w:r>
     </w:p>
     <w:p>
@@ -881,11 +1939,11 @@
         <w:pStyle w:val="Compact"/>
         <w:numPr>
           <w:ilvl w:val="0"/>
-          <w:numId w:val="1006"/>
+          <w:numId w:val="7"/>
         </w:numPr>
       </w:pPr>
       <w:r>
-        <w:t xml:space="preserve">Any indirect, special, consequential, or incidental loss arising from your use of, or inability to use, the service</w:t>
+        <w:t>Any indirect, special, consequential, or incidental loss arising from your use of, or inability to use, the service</w:t>
       </w:r>
     </w:p>
     <w:p>
@@ -893,7 +1951,7 @@
         <w:pStyle w:val="FirstParagraph"/>
       </w:pPr>
       <w:r>
-        <w:t xml:space="preserve">Nothing in these terms excludes or limits our liability for:</w:t>
+        <w:t>Nothing in these terms excludes or limits our liability for:</w:t>
       </w:r>
     </w:p>
     <w:p>
@@ -901,11 +1959,11 @@
         <w:pStyle w:val="Compact"/>
         <w:numPr>
           <w:ilvl w:val="0"/>
-          <w:numId w:val="1007"/>
+          <w:numId w:val="8"/>
         </w:numPr>
       </w:pPr>
       <w:r>
-        <w:t xml:space="preserve">Death or personal injury caused by our negligence</w:t>
+        <w:t>Death or personal injury caused by our negligence</w:t>
       </w:r>
     </w:p>
     <w:p>
@@ -913,11 +1971,11 @@
         <w:pStyle w:val="Compact"/>
         <w:numPr>
           <w:ilvl w:val="0"/>
-          <w:numId w:val="1007"/>
+          <w:numId w:val="8"/>
         </w:numPr>
       </w:pPr>
       <w:r>
-        <w:t xml:space="preserve">Fraud or fraudulent misrepresentation</w:t>
+        <w:t>Fraud or fraudulent misrepresentation</w:t>
       </w:r>
     </w:p>
     <w:p>
@@ -925,11 +1983,11 @@
         <w:pStyle w:val="Compact"/>
         <w:numPr>
           <w:ilvl w:val="0"/>
-          <w:numId w:val="1007"/>
+          <w:numId w:val="8"/>
         </w:numPr>
       </w:pPr>
       <w:r>
-        <w:t xml:space="preserve">Any other liability that cannot lawfully be excluded or limited</w:t>
+        <w:t>Any other liability that cannot lawfully be excluded or limited</w:t>
       </w:r>
     </w:p>
     <w:p>
@@ -937,25 +1995,27 @@
         <w:pStyle w:val="FirstParagraph"/>
       </w:pPr>
       <w:r>
-        <w:t xml:space="preserve">Because the service is provided free of charge, these limitations reflect a fair allocation of risk between us.</w:t>
-      </w:r>
-    </w:p>
-    <w:p>
-      <w:r>
-        <w:pict>
-          <v:rect style="width:0;height:1.5pt" o:hralign="center" o:hrstd="t" o:hr="t"/>
+        <w:t>Because the service is provided free of charge, these limitations reflect a fair allocation of risk between us.</w:t>
+      </w:r>
+    </w:p>
+    <w:p>
+      <w:r>
+        <w:pict w14:anchorId="0C4C91D0">
+          <v:rect id="_x0000_i1035" style="width:0;height:1.5pt" o:hralign="center" o:hrstd="t" o:hr="t"/>
         </w:pict>
       </w:r>
     </w:p>
-    <w:bookmarkEnd w:id="18"/>
-    <w:bookmarkStart w:id="19" w:name="suspension-and-termination"/>
     <w:p>
       <w:pPr>
         <w:pStyle w:val="Heading2"/>
       </w:pPr>
-      <w:r>
-        <w:t xml:space="preserve">11. Suspension and Termination</w:t>
-      </w:r>
+      <w:bookmarkStart w:id="22" w:name="suspension-and-termination"/>
+      <w:bookmarkStart w:id="23" w:name="_Toc236832803"/>
+      <w:bookmarkEnd w:id="20"/>
+      <w:r>
+        <w:t>11. Suspension and Termination</w:t>
+      </w:r>
+      <w:bookmarkEnd w:id="23"/>
     </w:p>
     <w:p>
       <w:pPr>
@@ -966,13 +2026,10 @@
           <w:b/>
           <w:bCs/>
         </w:rPr>
-        <w:t xml:space="preserve">You</w:t>
-      </w:r>
-      <w:r>
-        <w:t xml:space="preserve"> </w:t>
-      </w:r>
-      <w:r>
-        <w:t xml:space="preserve">may close your account at any time from within the service. Closure is immediate and all associated data will be permanently deleted from our live systems. Automated backup copies are permanently removed within 7 days as part of standard backup rotation.</w:t>
+        <w:t>You</w:t>
+      </w:r>
+      <w:r>
+        <w:t xml:space="preserve"> may close your account at any time from within the service. Closure is immediate and all associated data will be permanently deleted from our live systems. Automated backup copies are permanently removed within 7 days as part of standard backup rotation.</w:t>
       </w:r>
     </w:p>
     <w:p>
@@ -984,13 +2041,10 @@
           <w:b/>
           <w:bCs/>
         </w:rPr>
-        <w:t xml:space="preserve">We</w:t>
-      </w:r>
-      <w:r>
-        <w:t xml:space="preserve"> </w:t>
-      </w:r>
-      <w:r>
-        <w:t xml:space="preserve">may suspend or terminate your account if:</w:t>
+        <w:t>We</w:t>
+      </w:r>
+      <w:r>
+        <w:t xml:space="preserve"> may suspend or terminate your account if:</w:t>
       </w:r>
     </w:p>
     <w:p>
@@ -998,11 +2052,11 @@
         <w:pStyle w:val="Compact"/>
         <w:numPr>
           <w:ilvl w:val="0"/>
-          <w:numId w:val="1008"/>
+          <w:numId w:val="9"/>
         </w:numPr>
       </w:pPr>
       <w:r>
-        <w:t xml:space="preserve">You breach any of these terms</w:t>
+        <w:t>You breach any of these terms</w:t>
       </w:r>
     </w:p>
     <w:p>
@@ -1010,11 +2064,11 @@
         <w:pStyle w:val="Compact"/>
         <w:numPr>
           <w:ilvl w:val="0"/>
-          <w:numId w:val="1008"/>
+          <w:numId w:val="9"/>
         </w:numPr>
       </w:pPr>
       <w:r>
-        <w:t xml:space="preserve">We reasonably believe your account is being used fraudulently, abusively, or in a way that may harm other users or the service</w:t>
+        <w:t>We reasonably believe your account is being used fraudulently, abusively, or in a way that may harm other users or the service</w:t>
       </w:r>
     </w:p>
     <w:p>
@@ -1022,11 +2076,11 @@
         <w:pStyle w:val="Compact"/>
         <w:numPr>
           <w:ilvl w:val="0"/>
-          <w:numId w:val="1008"/>
+          <w:numId w:val="9"/>
         </w:numPr>
       </w:pPr>
       <w:r>
-        <w:t xml:space="preserve">We are required to do so by law</w:t>
+        <w:t>We are required to do so by law</w:t>
       </w:r>
     </w:p>
     <w:p>
@@ -1034,7 +2088,7 @@
         <w:pStyle w:val="FirstParagraph"/>
       </w:pPr>
       <w:r>
-        <w:t xml:space="preserve">Where we suspend or terminate your account for a breach, we will inform you unless we are legally prevented from doing so. Where possible, we will give you the opportunity to export your data before termination takes effect.</w:t>
+        <w:t>Where we suspend or terminate your account for a breach, we will inform you unless we are legally prevented from doing so. Where possible, we will give you the opportunity to export your data before termination takes effect.</w:t>
       </w:r>
     </w:p>
     <w:p>
@@ -1042,48 +2096,44 @@
         <w:pStyle w:val="BodyText"/>
       </w:pPr>
       <w:r>
-        <w:t xml:space="preserve">Accounts that have not been used for two years are subject to our inactivity deletion policy. Please see our</w:t>
-      </w:r>
-      <w:r>
-        <w:t xml:space="preserve"> </w:t>
+        <w:t xml:space="preserve">Accounts that have not been used for two years are subject to our inactivity deletion policy. Please see our </w:t>
       </w:r>
       <w:r>
         <w:rPr>
           <w:b/>
           <w:bCs/>
         </w:rPr>
-        <w:t xml:space="preserve">Privacy Policy</w:t>
-      </w:r>
-      <w:r>
-        <w:t xml:space="preserve"> </w:t>
-      </w:r>
-      <w:r>
-        <w:t xml:space="preserve">for details.</w:t>
-      </w:r>
-    </w:p>
-    <w:p>
-      <w:r>
-        <w:pict>
-          <v:rect style="width:0;height:1.5pt" o:hralign="center" o:hrstd="t" o:hr="t"/>
+        <w:t>Privacy Policy</w:t>
+      </w:r>
+      <w:r>
+        <w:t xml:space="preserve"> for details.</w:t>
+      </w:r>
+    </w:p>
+    <w:p>
+      <w:r>
+        <w:pict w14:anchorId="7082837E">
+          <v:rect id="_x0000_i1036" style="width:0;height:1.5pt" o:hralign="center" o:hrstd="t" o:hr="t"/>
         </w:pict>
       </w:r>
     </w:p>
-    <w:bookmarkEnd w:id="19"/>
-    <w:bookmarkStart w:id="20" w:name="changes-to-these-terms"/>
     <w:p>
       <w:pPr>
         <w:pStyle w:val="Heading2"/>
       </w:pPr>
-      <w:r>
-        <w:t xml:space="preserve">12. Changes to These Terms</w:t>
-      </w:r>
+      <w:bookmarkStart w:id="24" w:name="changes-to-these-terms"/>
+      <w:bookmarkStart w:id="25" w:name="_Toc236832804"/>
+      <w:bookmarkEnd w:id="22"/>
+      <w:r>
+        <w:t>12. Changes to These Terms</w:t>
+      </w:r>
+      <w:bookmarkEnd w:id="25"/>
     </w:p>
     <w:p>
       <w:pPr>
         <w:pStyle w:val="FirstParagraph"/>
       </w:pPr>
       <w:r>
-        <w:t xml:space="preserve">We may update these terms from time to time. If we make significant changes, we will notify you by email at least 14 days before the changes take effect. Continued use of the service after the effective date of any change constitutes your acceptance of the updated terms.</w:t>
+        <w:t>We may update these terms from time to time. If we make significant changes, we will notify you by email at least 14 days before the changes take effect. Continued use of the service after the effective date of any change constitutes your acceptance of the updated terms.</w:t>
       </w:r>
     </w:p>
     <w:p>
@@ -1091,7 +2141,7 @@
         <w:pStyle w:val="BodyText"/>
       </w:pPr>
       <w:r>
-        <w:t xml:space="preserve">If you do not agree to the updated terms, you should stop using the service and delete your account before the changes take effect.</w:t>
+        <w:t>If you do not agree to the updated terms, you should stop using the service and delete your account before the changes take effect.</w:t>
       </w:r>
     </w:p>
     <w:p>
@@ -1099,69 +2149,61 @@
         <w:pStyle w:val="BodyText"/>
       </w:pPr>
       <w:r>
-        <w:t xml:space="preserve">The</w:t>
-      </w:r>
-      <w:r>
-        <w:t xml:space="preserve"> </w:t>
-      </w:r>
-      <w:r>
-        <w:t xml:space="preserve">“Last updated”</w:t>
-      </w:r>
-      <w:r>
-        <w:t xml:space="preserve"> </w:t>
-      </w:r>
-      <w:r>
-        <w:t xml:space="preserve">date at the top of this page tells you when the terms were most recently changed.</w:t>
-      </w:r>
-    </w:p>
-    <w:p>
-      <w:r>
-        <w:pict>
-          <v:rect style="width:0;height:1.5pt" o:hralign="center" o:hrstd="t" o:hr="t"/>
+        <w:t>The “Last updated” date at the top of this page tells you when the terms were most recently changed.</w:t>
+      </w:r>
+    </w:p>
+    <w:p>
+      <w:r>
+        <w:pict w14:anchorId="59FB7C0C">
+          <v:rect id="_x0000_i1037" style="width:0;height:1.5pt" o:hralign="center" o:hrstd="t" o:hr="t"/>
         </w:pict>
       </w:r>
     </w:p>
-    <w:bookmarkEnd w:id="20"/>
-    <w:bookmarkStart w:id="21" w:name="governing-law"/>
     <w:p>
       <w:pPr>
         <w:pStyle w:val="Heading2"/>
       </w:pPr>
-      <w:r>
-        <w:t xml:space="preserve">13. Governing Law</w:t>
-      </w:r>
+      <w:bookmarkStart w:id="26" w:name="governing-law"/>
+      <w:bookmarkStart w:id="27" w:name="_Toc236832805"/>
+      <w:bookmarkEnd w:id="24"/>
+      <w:r>
+        <w:t>13. Governing Law</w:t>
+      </w:r>
+      <w:bookmarkEnd w:id="27"/>
     </w:p>
     <w:p>
       <w:pPr>
         <w:pStyle w:val="FirstParagraph"/>
       </w:pPr>
       <w:r>
-        <w:t xml:space="preserve">These Terms of Service are governed by the laws of England and Wales. Any dispute arising from or in connection with your use of Grant Pathway will be subject to the exclusive jurisdiction of the courts of England and Wales.</w:t>
-      </w:r>
-    </w:p>
-    <w:p>
-      <w:r>
-        <w:pict>
-          <v:rect style="width:0;height:1.5pt" o:hralign="center" o:hrstd="t" o:hr="t"/>
+        <w:t>These Terms of Service are governed by the laws of England and Wales. Any dispute arising from or in connection with your use of Grant Pathway will be subject to the exclusive jurisdiction of the courts of England and Wales.</w:t>
+      </w:r>
+    </w:p>
+    <w:p>
+      <w:r>
+        <w:pict w14:anchorId="1FD2BB31">
+          <v:rect id="_x0000_i1038" style="width:0;height:1.5pt" o:hralign="center" o:hrstd="t" o:hr="t"/>
         </w:pict>
       </w:r>
     </w:p>
-    <w:bookmarkEnd w:id="21"/>
-    <w:bookmarkStart w:id="22" w:name="contact"/>
     <w:p>
       <w:pPr>
         <w:pStyle w:val="Heading2"/>
       </w:pPr>
-      <w:r>
-        <w:t xml:space="preserve">14. Contact</w:t>
-      </w:r>
+      <w:bookmarkStart w:id="28" w:name="contact"/>
+      <w:bookmarkStart w:id="29" w:name="_Toc236832806"/>
+      <w:bookmarkEnd w:id="26"/>
+      <w:r>
+        <w:t>14. Contact</w:t>
+      </w:r>
+      <w:bookmarkEnd w:id="29"/>
     </w:p>
     <w:p>
       <w:pPr>
         <w:pStyle w:val="FirstParagraph"/>
       </w:pPr>
       <w:r>
-        <w:t xml:space="preserve">For any questions about these terms, please contact us:</w:t>
+        <w:t>For any questions about these terms, please contact us:</w:t>
       </w:r>
     </w:p>
     <w:p>
@@ -1173,13 +2215,10 @@
           <w:b/>
           <w:bCs/>
         </w:rPr>
-        <w:t xml:space="preserve">Email:</w:t>
-      </w:r>
-      <w:r>
-        <w:t xml:space="preserve"> </w:t>
-      </w:r>
-      <w:r>
-        <w:t xml:space="preserve">admin@rapidglobe.com</w:t>
+        <w:t>Email:</w:t>
+      </w:r>
+      <w:r>
+        <w:t xml:space="preserve"> admin@rapidglobe.com</w:t>
       </w:r>
     </w:p>
     <w:p>
@@ -1191,19 +2230,16 @@
           <w:b/>
           <w:bCs/>
         </w:rPr>
-        <w:t xml:space="preserve">Post:</w:t>
-      </w:r>
-      <w:r>
-        <w:t xml:space="preserve"> </w:t>
-      </w:r>
-      <w:r>
-        <w:t xml:space="preserve">RapidGlobe Ltd, Ground Floor Suite, Crown House, 40 North Street, Hornchurch, Essex RM11 1EW</w:t>
-      </w:r>
-    </w:p>
-    <w:p>
-      <w:r>
-        <w:pict>
-          <v:rect style="width:0;height:1.5pt" o:hralign="center" o:hrstd="t" o:hr="t"/>
+        <w:t>Post:</w:t>
+      </w:r>
+      <w:r>
+        <w:t xml:space="preserve"> RapidGlobe Ltd, Ground Floor Suite, Crown House, 40 North Street, Hornchurch, Essex RM11 1EW</w:t>
+      </w:r>
+    </w:p>
+    <w:p>
+      <w:r>
+        <w:pict w14:anchorId="726410AD">
+          <v:rect id="_x0000_i1039" style="width:0;height:1.5pt" o:hralign="center" o:hrstd="t" o:hr="t"/>
         </w:pict>
       </w:r>
     </w:p>
@@ -1216,7 +2252,7 @@
           <w:i/>
           <w:iCs/>
         </w:rPr>
-        <w:t xml:space="preserve">Grant Pathway is provided by RapidGlobe Ltd (company number 05615649), registered in England and Wales.</w:t>
+        <w:t>Grant Pathway is provided by RapidGlobe Ltd (company number 05615649), registered in England and Wales.</w:t>
       </w:r>
     </w:p>
     <w:p>
@@ -1228,7 +2264,7 @@
           <w:i/>
           <w:iCs/>
         </w:rPr>
-        <w:t xml:space="preserve">Version: 1.4</w:t>
+        <w:t>Version: 1.4</w:t>
       </w:r>
       <w:r>
         <w:t xml:space="preserve"> </w:t>
@@ -1238,7 +2274,7 @@
           <w:i/>
           <w:iCs/>
         </w:rPr>
-        <w:t xml:space="preserve">Effective date: 5 August 2026</w:t>
+        <w:t>Effective date: 5 August 2026</w:t>
       </w:r>
       <w:r>
         <w:t xml:space="preserve"> </w:t>
@@ -1248,48 +2284,29 @@
           <w:i/>
           <w:iCs/>
         </w:rPr>
-        <w:t xml:space="preserve">Last updated: 30 July 2026</w:t>
-      </w:r>
-    </w:p>
-    <w:bookmarkEnd w:id="22"/>
-    <w:bookmarkEnd w:id="23"/>
+        <w:t>Last updated: 30 July 2026</w:t>
+      </w:r>
+      <w:bookmarkEnd w:id="0"/>
+      <w:bookmarkEnd w:id="28"/>
+    </w:p>
     <w:sectPr>
       <w:footnotePr>
         <w:numRestart w:val="eachSect"/>
       </w:footnotePr>
+      <w:pgSz w:w="12240" w:h="15840"/>
+      <w:pgMar w:top="1440" w:right="1440" w:bottom="1440" w:left="1440" w:header="720" w:footer="720" w:gutter="0"/>
+      <w:cols w:space="720"/>
     </w:sectPr>
   </w:body>
 </w:document>
 </file>
 
-<file path=word/comments.xml><?xml version="1.0" encoding="utf-8"?>
-<w:comments xmlns:w="http://schemas.openxmlformats.org/wordprocessingml/2006/main" xmlns:m="http://schemas.openxmlformats.org/officeDocument/2006/math" xmlns:r="http://schemas.openxmlformats.org/officeDocument/2006/relationships" xmlns:o="urn:schemas-microsoft-com:office:office" xmlns:v="urn:schemas-microsoft-com:vml" xmlns:w10="urn:schemas-microsoft-com:office:word" xmlns:a="http://schemas.openxmlformats.org/drawingml/2006/main" xmlns:pic="http://schemas.openxmlformats.org/drawingml/2006/picture" xmlns:wp="http://schemas.openxmlformats.org/drawingml/2006/wordprocessingDrawing"/>
-</file>
-
-<file path=word/footnotes.xml><?xml version="1.0" encoding="utf-8"?>
-<w:footnotes xmlns:w="http://schemas.openxmlformats.org/wordprocessingml/2006/main" xmlns:m="http://schemas.openxmlformats.org/officeDocument/2006/math" xmlns:r="http://schemas.openxmlformats.org/officeDocument/2006/relationships" xmlns:o="urn:schemas-microsoft-com:office:office" xmlns:v="urn:schemas-microsoft-com:vml" xmlns:w10="urn:schemas-microsoft-com:office:word" xmlns:a="http://schemas.openxmlformats.org/drawingml/2006/main" xmlns:pic="http://schemas.openxmlformats.org/drawingml/2006/picture" xmlns:wp="http://schemas.openxmlformats.org/drawingml/2006/wordprocessingDrawing">
-  <w:footnote w:type="continuationSeparator" w:id="0">
-    <w:p>
-      <w:r>
-        <w:continuationSeparator/>
-      </w:r>
-    </w:p>
-  </w:footnote>
-  <w:footnote w:type="separator" w:id="-1">
-    <w:p>
-      <w:r>
-        <w:separator/>
-      </w:r>
-    </w:p>
-  </w:footnote>
-</w:footnotes>
-</file>
-
 <file path=word/numbering.xml><?xml version="1.0" encoding="utf-8"?>
-<w:numbering xmlns:w="http://schemas.openxmlformats.org/wordprocessingml/2006/main">
-  <w:abstractNum w:abstractNumId="990">
+<w:numbering xmlns:wpc="http://schemas.microsoft.com/office/word/2010/wordprocessingCanvas" xmlns:cx="http://schemas.microsoft.com/office/drawing/2014/chartex" xmlns:cx1="http://schemas.microsoft.com/office/drawing/2015/9/8/chartex" xmlns:cx2="http://schemas.microsoft.com/office/drawing/2015/10/21/chartex" xmlns:cx3="http://schemas.microsoft.com/office/drawing/2016/5/9/chartex" xmlns:cx4="http://schemas.microsoft.com/office/drawing/2016/5/10/chartex" xmlns:cx5="http://schemas.microsoft.com/office/drawing/2016/5/11/chartex" xmlns:cx6="http://schemas.microsoft.com/office/drawing/2016/5/12/chartex" xmlns:cx7="http://schemas.microsoft.com/office/drawing/2016/5/13/chartex" xmlns:cx8="http://schemas.microsoft.com/office/drawing/2016/5/14/chartex" xmlns:mc="http://schemas.openxmlformats.org/markup-compatibility/2006" xmlns:aink="http://schemas.microsoft.com/office/drawing/2016/ink" xmlns:am3d="http://schemas.microsoft.com/office/drawing/2017/model3d" xmlns:o="urn:schemas-microsoft-com:office:office" xmlns:oel="http://schemas.microsoft.com/office/2019/extlst" xmlns:r="http://schemas.openxmlformats.org/officeDocument/2006/relationships" xmlns:m="http://schemas.openxmlformats.org/officeDocument/2006/math" xmlns:v="urn:schemas-microsoft-com:vml" xmlns:wp14="http://schemas.microsoft.com/office/word/2010/wordprocessingDrawing" xmlns:wp="http://schemas.openxmlformats.org/drawingml/2006/wordprocessingDrawing" xmlns:w10="urn:schemas-microsoft-com:office:word" xmlns:w="http://schemas.openxmlformats.org/wordprocessingml/2006/main" xmlns:w14="http://schemas.microsoft.com/office/word/2010/wordml" xmlns:w15="http://schemas.microsoft.com/office/word/2012/wordml" xmlns:w16cei="http://schemas.microsoft.com/office/word/2026/wordml/cei" xmlns:w16cex="http://schemas.microsoft.com/office/word/2018/wordml/cex" xmlns:w16cid="http://schemas.microsoft.com/office/word/2016/wordml/cid" xmlns:w16="http://schemas.microsoft.com/office/word/2018/wordml" xmlns:w16du="http://schemas.microsoft.com/office/word/2023/wordml/word16du" xmlns:w16sdtdh="http://schemas.microsoft.com/office/word/2020/wordml/sdtdatahash" xmlns:w16sdtfl="http://schemas.microsoft.com/office/word/2024/wordml/sdtformatlock" xmlns:w16se="http://schemas.microsoft.com/office/word/2015/wordml/symex" xmlns:wpg="http://schemas.microsoft.com/office/word/2010/wordprocessingGroup" xmlns:wpi="http://schemas.microsoft.com/office/word/2010/wordprocessingInk" xmlns:wne="http://schemas.microsoft.com/office/word/2006/wordml" xmlns:wps="http://schemas.microsoft.com/office/word/2010/wordprocessingShape" mc:Ignorable="w14 w15 w16se w16cid w16 w16cex w16sdtdh w16sdtfl w16du wp14">
+  <w:abstractNum w:abstractNumId="0" w15:restartNumberingAfterBreak="0">
     <w:nsid w:val="0000A990"/>
     <w:multiLevelType w:val="multilevel"/>
+    <w:tmpl w:val="3E2C903E"/>
     <w:lvl w:ilvl="0">
       <w:numFmt w:val="bullet"/>
       <w:lvlText w:val=" "/>
@@ -1363,9 +2380,10 @@
       </w:pPr>
     </w:lvl>
   </w:abstractNum>
-  <w:abstractNum w:abstractNumId="991">
+  <w:abstractNum w:abstractNumId="1" w15:restartNumberingAfterBreak="0">
     <w:nsid w:val="0000A991"/>
     <w:multiLevelType w:val="multilevel"/>
+    <w:tmpl w:val="010A2CB8"/>
     <w:lvl w:ilvl="0">
       <w:numFmt w:val="bullet"/>
       <w:lvlText w:val=""/>
@@ -1466,45 +2484,45 @@
       </w:rPr>
     </w:lvl>
   </w:abstractNum>
-  <w:num w:numId="1000">
-    <w:abstractNumId w:val="990"/>
+  <w:num w:numId="1" w16cid:durableId="431900527">
+    <w:abstractNumId w:val="0"/>
   </w:num>
-  <w:num w:numId="1001">
-    <w:abstractNumId w:val="991"/>
+  <w:num w:numId="2" w16cid:durableId="1587299803">
+    <w:abstractNumId w:val="1"/>
   </w:num>
-  <w:num w:numId="1002">
-    <w:abstractNumId w:val="991"/>
+  <w:num w:numId="3" w16cid:durableId="1860241915">
+    <w:abstractNumId w:val="1"/>
   </w:num>
-  <w:num w:numId="1003">
-    <w:abstractNumId w:val="991"/>
+  <w:num w:numId="4" w16cid:durableId="1900092287">
+    <w:abstractNumId w:val="1"/>
   </w:num>
-  <w:num w:numId="1004">
-    <w:abstractNumId w:val="991"/>
+  <w:num w:numId="5" w16cid:durableId="1357151831">
+    <w:abstractNumId w:val="1"/>
   </w:num>
-  <w:num w:numId="1005">
-    <w:abstractNumId w:val="991"/>
+  <w:num w:numId="6" w16cid:durableId="121307762">
+    <w:abstractNumId w:val="1"/>
   </w:num>
-  <w:num w:numId="1006">
-    <w:abstractNumId w:val="991"/>
+  <w:num w:numId="7" w16cid:durableId="1508250455">
+    <w:abstractNumId w:val="1"/>
   </w:num>
-  <w:num w:numId="1007">
-    <w:abstractNumId w:val="991"/>
+  <w:num w:numId="8" w16cid:durableId="416170021">
+    <w:abstractNumId w:val="1"/>
   </w:num>
-  <w:num w:numId="1008">
-    <w:abstractNumId w:val="991"/>
+  <w:num w:numId="9" w16cid:durableId="1916474767">
+    <w:abstractNumId w:val="1"/>
   </w:num>
 </w:numbering>
 </file>
 
 <file path=word/styles.xml><?xml version="1.0" encoding="utf-8"?>
-<w:styles xmlns:r="http://schemas.openxmlformats.org/officeDocument/2006/relationships" xmlns:w="http://schemas.openxmlformats.org/wordprocessingml/2006/main">
+<w:styles xmlns:mc="http://schemas.openxmlformats.org/markup-compatibility/2006" xmlns:r="http://schemas.openxmlformats.org/officeDocument/2006/relationships" xmlns:w="http://schemas.openxmlformats.org/wordprocessingml/2006/main" xmlns:w14="http://schemas.microsoft.com/office/word/2010/wordml" xmlns:w15="http://schemas.microsoft.com/office/word/2012/wordml" xmlns:w16cex="http://schemas.microsoft.com/office/word/2018/wordml/cex" xmlns:w16cid="http://schemas.microsoft.com/office/word/2016/wordml/cid" xmlns:w16="http://schemas.microsoft.com/office/word/2018/wordml" xmlns:w16du="http://schemas.microsoft.com/office/word/2023/wordml/word16du" xmlns:w16sdtdh="http://schemas.microsoft.com/office/word/2020/wordml/sdtdatahash" xmlns:w16sdtfl="http://schemas.microsoft.com/office/word/2024/wordml/sdtformatlock" xmlns:w16se="http://schemas.microsoft.com/office/word/2015/wordml/symex" mc:Ignorable="w14 w15 w16se w16cid w16 w16cex w16sdtdh w16sdtfl w16du">
   <w:docDefaults>
     <w:rPrDefault>
       <w:rPr>
-        <w:rFonts w:asciiTheme="minorHAnsi" w:cstheme="minorBidi" w:eastAsiaTheme="minorEastAsia" w:hAnsiTheme="minorHAnsi"/>
+        <w:rFonts w:asciiTheme="minorHAnsi" w:eastAsiaTheme="minorEastAsia" w:hAnsiTheme="minorHAnsi" w:cstheme="minorBidi"/>
         <w:sz w:val="24"/>
         <w:szCs w:val="24"/>
-        <w:lang w:bidi="ar-SA" w:eastAsia="zh-CN" w:val="en-US"/>
+        <w:lang w:val="en-US" w:eastAsia="zh-CN" w:bidi="ar-SA"/>
       </w:rPr>
     </w:rPrDefault>
     <w:pPrDefault>
@@ -1513,168 +2531,258 @@
       </w:pPr>
     </w:pPrDefault>
   </w:docDefaults>
-  <w:latentStyles w:count="276" w:defLockedState="0" w:defQFormat="0" w:defSemiHidden="0" w:defUIPriority="0" w:defUnhideWhenUsed="0"/>
-  <w:style w:default="1" w:styleId="Normal" w:type="paragraph">
+  <w:latentStyles w:defLockedState="0" w:defUIPriority="0" w:defSemiHidden="0" w:defUnhideWhenUsed="0" w:defQFormat="0" w:count="376">
+    <w:lsdException w:name="toc 1" w:uiPriority="39"/>
+    <w:lsdException w:name="toc 2" w:uiPriority="39"/>
+    <w:lsdException w:name="Hyperlink" w:uiPriority="99"/>
+    <w:lsdException w:name="Normal Table" w:semiHidden="1" w:unhideWhenUsed="1"/>
+    <w:lsdException w:name="Table Simple 1" w:semiHidden="1" w:unhideWhenUsed="1"/>
+    <w:lsdException w:name="Table Simple 2" w:semiHidden="1" w:unhideWhenUsed="1"/>
+    <w:lsdException w:name="Table Simple 3" w:semiHidden="1" w:unhideWhenUsed="1"/>
+    <w:lsdException w:name="Table Classic 1" w:semiHidden="1" w:unhideWhenUsed="1"/>
+    <w:lsdException w:name="Table Classic 2" w:semiHidden="1" w:unhideWhenUsed="1"/>
+    <w:lsdException w:name="Table Classic 3" w:semiHidden="1" w:unhideWhenUsed="1"/>
+    <w:lsdException w:name="Table Classic 4" w:semiHidden="1" w:unhideWhenUsed="1"/>
+    <w:lsdException w:name="Table Colorful 1" w:semiHidden="1" w:unhideWhenUsed="1"/>
+    <w:lsdException w:name="Table Colorful 2" w:semiHidden="1" w:unhideWhenUsed="1"/>
+    <w:lsdException w:name="Table Colorful 3" w:semiHidden="1" w:unhideWhenUsed="1"/>
+    <w:lsdException w:name="Table Columns 1" w:semiHidden="1" w:unhideWhenUsed="1"/>
+    <w:lsdException w:name="Table Columns 2" w:semiHidden="1" w:unhideWhenUsed="1"/>
+    <w:lsdException w:name="Table Columns 3" w:semiHidden="1" w:unhideWhenUsed="1"/>
+    <w:lsdException w:name="Table Columns 4" w:semiHidden="1" w:unhideWhenUsed="1"/>
+    <w:lsdException w:name="Table Columns 5" w:semiHidden="1" w:unhideWhenUsed="1"/>
+    <w:lsdException w:name="Table Grid 1" w:semiHidden="1" w:unhideWhenUsed="1"/>
+    <w:lsdException w:name="Table Grid 2" w:semiHidden="1" w:unhideWhenUsed="1"/>
+    <w:lsdException w:name="Table Grid 3" w:semiHidden="1" w:unhideWhenUsed="1"/>
+    <w:lsdException w:name="Table Grid 4" w:semiHidden="1" w:unhideWhenUsed="1"/>
+    <w:lsdException w:name="Table Grid 5" w:semiHidden="1" w:unhideWhenUsed="1"/>
+    <w:lsdException w:name="Table Grid 6" w:semiHidden="1" w:unhideWhenUsed="1"/>
+    <w:lsdException w:name="Table Grid 7" w:semiHidden="1" w:unhideWhenUsed="1"/>
+    <w:lsdException w:name="Table Grid 8" w:semiHidden="1" w:unhideWhenUsed="1"/>
+    <w:lsdException w:name="Table List 1" w:semiHidden="1" w:unhideWhenUsed="1"/>
+    <w:lsdException w:name="Table List 2" w:semiHidden="1" w:unhideWhenUsed="1"/>
+    <w:lsdException w:name="Table List 3" w:semiHidden="1" w:unhideWhenUsed="1"/>
+    <w:lsdException w:name="Table List 4" w:semiHidden="1" w:unhideWhenUsed="1"/>
+    <w:lsdException w:name="Table List 5" w:semiHidden="1" w:unhideWhenUsed="1"/>
+    <w:lsdException w:name="Table List 6" w:semiHidden="1" w:unhideWhenUsed="1"/>
+    <w:lsdException w:name="Table List 7" w:semiHidden="1" w:unhideWhenUsed="1"/>
+    <w:lsdException w:name="Table List 8" w:semiHidden="1" w:unhideWhenUsed="1"/>
+    <w:lsdException w:name="Table 3D effects 1" w:semiHidden="1" w:unhideWhenUsed="1"/>
+    <w:lsdException w:name="Table 3D effects 2" w:semiHidden="1" w:unhideWhenUsed="1"/>
+    <w:lsdException w:name="Table 3D effects 3" w:semiHidden="1" w:unhideWhenUsed="1"/>
+    <w:lsdException w:name="Table Contemporary" w:semiHidden="1" w:unhideWhenUsed="1"/>
+    <w:lsdException w:name="Table Elegant" w:semiHidden="1" w:unhideWhenUsed="1"/>
+    <w:lsdException w:name="Table Professional" w:semiHidden="1" w:unhideWhenUsed="1"/>
+    <w:lsdException w:name="Table Subtle 1" w:semiHidden="1" w:unhideWhenUsed="1"/>
+    <w:lsdException w:name="Table Subtle 2" w:semiHidden="1" w:unhideWhenUsed="1"/>
+    <w:lsdException w:name="Table Web 1" w:semiHidden="1" w:unhideWhenUsed="1"/>
+    <w:lsdException w:name="Table Web 2" w:semiHidden="1" w:unhideWhenUsed="1"/>
+    <w:lsdException w:name="Table Web 3" w:semiHidden="1" w:unhideWhenUsed="1"/>
+    <w:lsdException w:name="Table Theme" w:semiHidden="1" w:unhideWhenUsed="1"/>
+    <w:lsdException w:name="Light Shading"/>
+    <w:lsdException w:name="Light List"/>
+    <w:lsdException w:name="Light Grid"/>
+    <w:lsdException w:name="Medium Shading 1"/>
+    <w:lsdException w:name="Medium Shading 2"/>
+    <w:lsdException w:name="Medium List 1"/>
+    <w:lsdException w:name="Medium List 2"/>
+    <w:lsdException w:name="Medium Grid 1"/>
+    <w:lsdException w:name="Medium Grid 2"/>
+    <w:lsdException w:name="Medium Grid 3"/>
+    <w:lsdException w:name="Dark List"/>
+    <w:lsdException w:name="Colorful Shading"/>
+    <w:lsdException w:name="Colorful List"/>
+    <w:lsdException w:name="Colorful Grid"/>
+    <w:lsdException w:name="Light Shading Accent 1"/>
+    <w:lsdException w:name="Light List Accent 1"/>
+    <w:lsdException w:name="Light Grid Accent 1"/>
+    <w:lsdException w:name="Medium Shading 1 Accent 1"/>
+    <w:lsdException w:name="Medium Shading 2 Accent 1"/>
+    <w:lsdException w:name="Medium List 1 Accent 1"/>
+    <w:lsdException w:name="Medium List 2 Accent 1"/>
+    <w:lsdException w:name="Medium Grid 1 Accent 1"/>
+    <w:lsdException w:name="Medium Grid 2 Accent 1"/>
+    <w:lsdException w:name="Medium Grid 3 Accent 1"/>
+    <w:lsdException w:name="Dark List Accent 1"/>
+    <w:lsdException w:name="Colorful Shading Accent 1"/>
+    <w:lsdException w:name="Colorful List Accent 1"/>
+    <w:lsdException w:name="Colorful Grid Accent 1"/>
+    <w:lsdException w:name="Light Shading Accent 2"/>
+    <w:lsdException w:name="Light List Accent 2"/>
+    <w:lsdException w:name="Light Grid Accent 2"/>
+    <w:lsdException w:name="Medium Shading 1 Accent 2"/>
+    <w:lsdException w:name="Medium Shading 2 Accent 2"/>
+    <w:lsdException w:name="Medium List 1 Accent 2"/>
+    <w:lsdException w:name="Medium List 2 Accent 2"/>
+    <w:lsdException w:name="Medium Grid 1 Accent 2"/>
+    <w:lsdException w:name="Medium Grid 2 Accent 2"/>
+    <w:lsdException w:name="Medium Grid 3 Accent 2"/>
+    <w:lsdException w:name="Dark List Accent 2"/>
+    <w:lsdException w:name="Colorful Shading Accent 2"/>
+    <w:lsdException w:name="Colorful List Accent 2"/>
+    <w:lsdException w:name="Colorful Grid Accent 2"/>
+    <w:lsdException w:name="Light Shading Accent 3"/>
+    <w:lsdException w:name="Light List Accent 3"/>
+    <w:lsdException w:name="Light Grid Accent 3"/>
+    <w:lsdException w:name="Medium Shading 1 Accent 3"/>
+    <w:lsdException w:name="Medium Shading 2 Accent 3"/>
+    <w:lsdException w:name="Medium List 1 Accent 3"/>
+    <w:lsdException w:name="Medium List 2 Accent 3"/>
+    <w:lsdException w:name="Medium Grid 1 Accent 3"/>
+    <w:lsdException w:name="Medium Grid 2 Accent 3"/>
+    <w:lsdException w:name="Medium Grid 3 Accent 3"/>
+    <w:lsdException w:name="Dark List Accent 3"/>
+    <w:lsdException w:name="Colorful Shading Accent 3"/>
+    <w:lsdException w:name="Colorful List Accent 3"/>
+    <w:lsdException w:name="Colorful Grid Accent 3"/>
+    <w:lsdException w:name="Light Shading Accent 4"/>
+    <w:lsdException w:name="Light List Accent 4"/>
+    <w:lsdException w:name="Light Grid Accent 4"/>
+    <w:lsdException w:name="Medium Shading 1 Accent 4"/>
+    <w:lsdException w:name="Medium Shading 2 Accent 4"/>
+    <w:lsdException w:name="Medium List 1 Accent 4"/>
+    <w:lsdException w:name="Medium List 2 Accent 4"/>
+    <w:lsdException w:name="Medium Grid 1 Accent 4"/>
+    <w:lsdException w:name="Medium Grid 2 Accent 4"/>
+    <w:lsdException w:name="Medium Grid 3 Accent 4"/>
+    <w:lsdException w:name="Dark List Accent 4"/>
+    <w:lsdException w:name="Colorful Shading Accent 4"/>
+    <w:lsdException w:name="Colorful List Accent 4"/>
+    <w:lsdException w:name="Colorful Grid Accent 4"/>
+    <w:lsdException w:name="Light Shading Accent 5"/>
+    <w:lsdException w:name="Light List Accent 5"/>
+    <w:lsdException w:name="Light Grid Accent 5"/>
+    <w:lsdException w:name="Medium Shading 1 Accent 5"/>
+    <w:lsdException w:name="Medium Shading 2 Accent 5"/>
+    <w:lsdException w:name="Medium List 1 Accent 5"/>
+    <w:lsdException w:name="Medium List 2 Accent 5"/>
+    <w:lsdException w:name="Medium Grid 1 Accent 5"/>
+    <w:lsdException w:name="Medium Grid 2 Accent 5"/>
+    <w:lsdException w:name="Medium Grid 3 Accent 5"/>
+    <w:lsdException w:name="Dark List Accent 5"/>
+    <w:lsdException w:name="Colorful Shading Accent 5"/>
+    <w:lsdException w:name="Colorful List Accent 5"/>
+    <w:lsdException w:name="Colorful Grid Accent 5"/>
+    <w:lsdException w:name="Light Shading Accent 6"/>
+    <w:lsdException w:name="Light List Accent 6"/>
+    <w:lsdException w:name="Light Grid Accent 6"/>
+    <w:lsdException w:name="Medium Shading 1 Accent 6"/>
+    <w:lsdException w:name="Medium Shading 2 Accent 6"/>
+    <w:lsdException w:name="Medium List 1 Accent 6"/>
+    <w:lsdException w:name="Medium List 2 Accent 6"/>
+    <w:lsdException w:name="Medium Grid 1 Accent 6"/>
+    <w:lsdException w:name="Medium Grid 2 Accent 6"/>
+    <w:lsdException w:name="Medium Grid 3 Accent 6"/>
+    <w:lsdException w:name="Dark List Accent 6"/>
+    <w:lsdException w:name="Colorful Shading Accent 6"/>
+    <w:lsdException w:name="Colorful List Accent 6"/>
+    <w:lsdException w:name="Colorful Grid Accent 6"/>
+    <w:lsdException w:name="Grid Table 4" w:uiPriority="49"/>
+    <w:lsdException w:name="Grid Table 5 Dark" w:uiPriority="50"/>
+    <w:lsdException w:name="Grid Table 6 Colorful" w:uiPriority="51"/>
+    <w:lsdException w:name="Grid Table 7 Colorful" w:uiPriority="52"/>
+    <w:lsdException w:name="Grid Table 1 Light Accent 1" w:uiPriority="46"/>
+    <w:lsdException w:name="Grid Table 2 Accent 1" w:uiPriority="47"/>
+    <w:lsdException w:name="Grid Table 3 Accent 1" w:uiPriority="48"/>
+    <w:lsdException w:name="Grid Table 4 Accent 1" w:uiPriority="49"/>
+    <w:lsdException w:name="Grid Table 5 Dark Accent 1" w:uiPriority="50"/>
+    <w:lsdException w:name="Grid Table 6 Colorful Accent 1" w:uiPriority="51"/>
+    <w:lsdException w:name="Grid Table 7 Colorful Accent 1" w:uiPriority="52"/>
+    <w:lsdException w:name="Grid Table 1 Light Accent 2" w:uiPriority="46"/>
+    <w:lsdException w:name="Grid Table 2 Accent 2" w:uiPriority="47"/>
+    <w:lsdException w:name="Grid Table 3 Accent 2" w:uiPriority="48"/>
+    <w:lsdException w:name="Grid Table 4 Accent 2" w:uiPriority="49"/>
+    <w:lsdException w:name="Grid Table 5 Dark Accent 2" w:uiPriority="50"/>
+    <w:lsdException w:name="Grid Table 6 Colorful Accent 2" w:uiPriority="51"/>
+    <w:lsdException w:name="Grid Table 7 Colorful Accent 2" w:uiPriority="52"/>
+    <w:lsdException w:name="Grid Table 1 Light Accent 3" w:uiPriority="46"/>
+    <w:lsdException w:name="Grid Table 2 Accent 3" w:uiPriority="47"/>
+    <w:lsdException w:name="Grid Table 3 Accent 3" w:uiPriority="48"/>
+    <w:lsdException w:name="Grid Table 4 Accent 3" w:uiPriority="49"/>
+    <w:lsdException w:name="Grid Table 5 Dark Accent 3" w:uiPriority="50"/>
+    <w:lsdException w:name="Grid Table 6 Colorful Accent 3" w:uiPriority="51"/>
+    <w:lsdException w:name="Grid Table 7 Colorful Accent 3" w:uiPriority="52"/>
+    <w:lsdException w:name="Grid Table 1 Light Accent 4" w:uiPriority="46"/>
+    <w:lsdException w:name="Grid Table 2 Accent 4" w:uiPriority="47"/>
+    <w:lsdException w:name="Grid Table 3 Accent 4" w:uiPriority="48"/>
+    <w:lsdException w:name="Grid Table 4 Accent 4" w:uiPriority="49"/>
+    <w:lsdException w:name="Grid Table 5 Dark Accent 4" w:uiPriority="50"/>
+    <w:lsdException w:name="Grid Table 6 Colorful Accent 4" w:uiPriority="51"/>
+    <w:lsdException w:name="Grid Table 7 Colorful Accent 4" w:uiPriority="52"/>
+    <w:lsdException w:name="Grid Table 1 Light Accent 5" w:uiPriority="46"/>
+    <w:lsdException w:name="Grid Table 2 Accent 5" w:uiPriority="47"/>
+    <w:lsdException w:name="Grid Table 3 Accent 5" w:uiPriority="48"/>
+    <w:lsdException w:name="Grid Table 4 Accent 5" w:uiPriority="49"/>
+    <w:lsdException w:name="Grid Table 5 Dark Accent 5" w:uiPriority="50"/>
+    <w:lsdException w:name="Grid Table 6 Colorful Accent 5" w:uiPriority="51"/>
+    <w:lsdException w:name="Grid Table 7 Colorful Accent 5" w:uiPriority="52"/>
+    <w:lsdException w:name="Grid Table 1 Light Accent 6" w:uiPriority="46"/>
+    <w:lsdException w:name="Grid Table 2 Accent 6" w:uiPriority="47"/>
+    <w:lsdException w:name="Grid Table 3 Accent 6" w:uiPriority="48"/>
+    <w:lsdException w:name="Grid Table 4 Accent 6" w:uiPriority="49"/>
+    <w:lsdException w:name="Grid Table 5 Dark Accent 6" w:uiPriority="50"/>
+    <w:lsdException w:name="Grid Table 6 Colorful Accent 6" w:uiPriority="51"/>
+    <w:lsdException w:name="Grid Table 7 Colorful Accent 6" w:uiPriority="52"/>
+    <w:lsdException w:name="List Table 1 Light" w:uiPriority="46"/>
+    <w:lsdException w:name="List Table 2" w:uiPriority="47"/>
+    <w:lsdException w:name="List Table 3" w:uiPriority="48"/>
+    <w:lsdException w:name="List Table 4" w:uiPriority="49"/>
+    <w:lsdException w:name="List Table 5 Dark" w:uiPriority="50"/>
+    <w:lsdException w:name="List Table 6 Colorful" w:uiPriority="51"/>
+    <w:lsdException w:name="List Table 7 Colorful" w:uiPriority="52"/>
+    <w:lsdException w:name="List Table 1 Light Accent 1" w:uiPriority="46"/>
+    <w:lsdException w:name="List Table 2 Accent 1" w:uiPriority="47"/>
+    <w:lsdException w:name="List Table 3 Accent 1" w:uiPriority="48"/>
+    <w:lsdException w:name="List Table 4 Accent 1" w:uiPriority="49"/>
+    <w:lsdException w:name="List Table 5 Dark Accent 1" w:uiPriority="50"/>
+    <w:lsdException w:name="List Table 6 Colorful Accent 1" w:uiPriority="51"/>
+    <w:lsdException w:name="List Table 7 Colorful Accent 1" w:uiPriority="52"/>
+    <w:lsdException w:name="List Table 1 Light Accent 2" w:uiPriority="46"/>
+    <w:lsdException w:name="List Table 2 Accent 2" w:uiPriority="47"/>
+    <w:lsdException w:name="List Table 3 Accent 2" w:uiPriority="48"/>
+    <w:lsdException w:name="List Table 4 Accent 2" w:uiPriority="49"/>
+    <w:lsdException w:name="List Table 5 Dark Accent 2" w:uiPriority="50"/>
+    <w:lsdException w:name="List Table 6 Colorful Accent 2" w:uiPriority="51"/>
+    <w:lsdException w:name="List Table 7 Colorful Accent 2" w:uiPriority="52"/>
+    <w:lsdException w:name="List Table 1 Light Accent 3" w:uiPriority="46"/>
+    <w:lsdException w:name="List Table 2 Accent 3" w:uiPriority="47"/>
+    <w:lsdException w:name="List Table 3 Accent 3" w:uiPriority="48"/>
+    <w:lsdException w:name="List Table 4 Accent 3" w:uiPriority="49"/>
+    <w:lsdException w:name="List Table 5 Dark Accent 3" w:uiPriority="50"/>
+    <w:lsdException w:name="List Table 6 Colorful Accent 3" w:uiPriority="51"/>
+    <w:lsdException w:name="List Table 7 Colorful Accent 3" w:uiPriority="52"/>
+    <w:lsdException w:name="List Table 1 Light Accent 4" w:uiPriority="46"/>
+    <w:lsdException w:name="List Table 2 Accent 4" w:uiPriority="47"/>
+    <w:lsdException w:name="List Table 3 Accent 4" w:uiPriority="48"/>
+    <w:lsdException w:name="List Table 4 Accent 4" w:uiPriority="49"/>
+    <w:lsdException w:name="List Table 5 Dark Accent 4" w:uiPriority="50"/>
+    <w:lsdException w:name="List Table 6 Colorful Accent 4" w:uiPriority="51"/>
+    <w:lsdException w:name="List Table 7 Colorful Accent 4" w:uiPriority="52"/>
+    <w:lsdException w:name="List Table 1 Light Accent 5" w:uiPriority="46"/>
+    <w:lsdException w:name="List Table 2 Accent 5" w:uiPriority="47"/>
+    <w:lsdException w:name="List Table 3 Accent 5" w:uiPriority="48"/>
+    <w:lsdException w:name="List Table 4 Accent 5" w:uiPriority="49"/>
+    <w:lsdException w:name="List Table 5 Dark Accent 5" w:uiPriority="50"/>
+    <w:lsdException w:name="List Table 6 Colorful Accent 5" w:uiPriority="51"/>
+    <w:lsdException w:name="List Table 7 Colorful Accent 5" w:uiPriority="52"/>
+    <w:lsdException w:name="List Table 1 Light Accent 6" w:uiPriority="46"/>
+    <w:lsdException w:name="List Table 2 Accent 6" w:uiPriority="47"/>
+    <w:lsdException w:name="List Table 3 Accent 6" w:uiPriority="48"/>
+    <w:lsdException w:name="List Table 4 Accent 6" w:uiPriority="49"/>
+    <w:lsdException w:name="List Table 5 Dark Accent 6" w:uiPriority="50"/>
+    <w:lsdException w:name="List Table 6 Colorful Accent 6" w:uiPriority="51"/>
+    <w:lsdException w:name="List Table 7 Colorful Accent 6" w:uiPriority="52"/>
+    <w:lsdException w:name="Mention" w:semiHidden="1" w:uiPriority="99" w:unhideWhenUsed="1"/>
+    <w:lsdException w:name="Smart Hyperlink" w:semiHidden="1" w:uiPriority="99" w:unhideWhenUsed="1"/>
+    <w:lsdException w:name="Hashtag" w:semiHidden="1" w:uiPriority="99" w:unhideWhenUsed="1"/>
+    <w:lsdException w:name="Unresolved Mention" w:semiHidden="1" w:uiPriority="99" w:unhideWhenUsed="1"/>
+    <w:lsdException w:name="Smart Link" w:semiHidden="1" w:uiPriority="99" w:unhideWhenUsed="1"/>
+  </w:latentStyles>
+  <w:style w:type="paragraph" w:default="1" w:styleId="Normal">
     <w:name w:val="Normal"/>
     <w:qFormat/>
   </w:style>
-  <w:style w:styleId="BodyText" w:type="paragraph">
-    <w:name w:val="Body Text"/>
-    <w:basedOn w:val="Normal"/>
-    <w:link w:val="BodyTextChar"/>
-    <w:qFormat/>
-    <w:pPr>
-      <w:spacing w:after="180" w:before="180"/>
-    </w:pPr>
-  </w:style>
-  <w:style w:customStyle="1" w:styleId="FirstParagraph" w:type="paragraph">
-    <w:name w:val="First Paragraph"/>
-    <w:basedOn w:val="BodyText"/>
-    <w:next w:val="BodyText"/>
-    <w:qFormat/>
-  </w:style>
-  <w:style w:customStyle="1" w:styleId="Compact" w:type="paragraph">
-    <w:name w:val="Compact"/>
-    <w:basedOn w:val="BodyText"/>
-    <w:qFormat/>
-    <w:pPr>
-      <w:spacing w:after="36" w:before="36"/>
-    </w:pPr>
-  </w:style>
-  <w:style w:styleId="Title" w:type="paragraph">
-    <w:name w:val="Title"/>
-    <w:basedOn w:val="Normal"/>
-    <w:next w:val="BodyText"/>
-    <w:link w:val="TitleChar"/>
-    <w:uiPriority w:val="10"/>
-    <w:qFormat/>
-    <w:rsid w:val="00A10FD9"/>
-    <w:pPr>
-      <w:spacing w:after="80" w:line="240" w:lineRule="auto"/>
-      <w:contextualSpacing/>
-      <w:jc w:val="center"/>
-    </w:pPr>
-    <w:rPr>
-      <w:rFonts w:asciiTheme="majorHAnsi" w:cstheme="majorBidi" w:eastAsiaTheme="majorEastAsia" w:hAnsiTheme="majorHAnsi"/>
-      <w:sz w:val="56"/>
-      <w:szCs w:val="56"/>
-    </w:rPr>
-  </w:style>
-  <w:style w:customStyle="1" w:styleId="TitleChar" w:type="character">
-    <w:name w:val="Title Char"/>
-    <w:basedOn w:val="DefaultParagraphFont"/>
-    <w:link w:val="Title"/>
-    <w:uiPriority w:val="10"/>
-    <w:rsid w:val="00A10FD9"/>
-    <w:rPr>
-      <w:rFonts w:asciiTheme="majorHAnsi" w:cstheme="majorBidi" w:eastAsiaTheme="majorEastAsia" w:hAnsiTheme="majorHAnsi"/>
-      <w:sz w:val="56"/>
-      <w:szCs w:val="56"/>
-    </w:rPr>
-  </w:style>
-  <w:style w:styleId="Subtitle" w:type="paragraph">
-    <w:name w:val="Subtitle"/>
-    <w:basedOn w:val="Title"/>
-    <w:next w:val="BodyText"/>
-    <w:link w:val="SubtitleChar"/>
-    <w:uiPriority w:val="11"/>
-    <w:qFormat/>
-    <w:rsid w:val="00A10FD9"/>
-    <w:pPr>
-      <w:numPr>
-        <w:ilvl w:val="1"/>
-      </w:numPr>
-    </w:pPr>
-    <w:rPr>
-      <w:rFonts w:cstheme="majorBidi" w:eastAsiaTheme="majorEastAsia"/>
-      <w:spacing w:val="15"/>
-      <w:sz w:val="28"/>
-      <w:szCs w:val="28"/>
-    </w:rPr>
-  </w:style>
-  <w:style w:customStyle="1" w:styleId="SubtitleChar" w:type="character">
-    <w:name w:val="Subtitle Char"/>
-    <w:basedOn w:val="DefaultParagraphFont"/>
-    <w:link w:val="Subtitle"/>
-    <w:uiPriority w:val="11"/>
-    <w:rsid w:val="00A10FD9"/>
-    <w:rPr>
-      <w:rFonts w:cstheme="majorBidi" w:eastAsiaTheme="majorEastAsia"/>
-      <w:color w:themeColor="text1" w:themeTint="A6" w:val="595959"/>
-      <w:spacing w:val="15"/>
-      <w:sz w:val="28"/>
-      <w:szCs w:val="28"/>
-    </w:rPr>
-  </w:style>
-  <w:style w:customStyle="1" w:styleId="Author" w:type="paragraph">
-    <w:name w:val="Author"/>
-    <w:basedOn w:val="Title"/>
-    <w:next w:val="BodyText"/>
-    <w:qFormat/>
-    <w:pPr>
-      <w:keepNext/>
-      <w:keepLines/>
-    </w:pPr>
-    <w:rPr>
-      <w:sz w:val="24"/>
-      <w:szCs w:val="24"/>
-    </w:rPr>
-  </w:style>
-  <w:style w:styleId="Date" w:type="paragraph">
-    <w:name w:val="Date"/>
-    <w:basedOn w:val="Title"/>
-    <w:next w:val="BodyText"/>
-    <w:qFormat/>
-    <w:pPr>
-      <w:keepNext/>
-      <w:keepLines/>
-    </w:pPr>
-    <w:rPr>
-      <w:sz w:val="24"/>
-      <w:szCs w:val="24"/>
-    </w:rPr>
-  </w:style>
-  <w:style w:customStyle="1" w:styleId="AbstractTitle" w:type="paragraph">
-    <w:name w:val="Abstract Title"/>
-    <w:basedOn w:val="Normal"/>
-    <w:next w:val="Abstract"/>
-    <w:qFormat/>
-    <w:pPr>
-      <w:keepNext/>
-      <w:keepLines/>
-      <w:spacing w:after="0" w:before="300"/>
-      <w:jc w:val="center"/>
-    </w:pPr>
-    <w:rPr>
-      <w:b/>
-      <w:sz w:val="20"/>
-      <w:szCs w:val="20"/>
-    </w:rPr>
-  </w:style>
-  <w:style w:customStyle="1" w:styleId="Abstract" w:type="paragraph">
-    <w:name w:val="Abstract"/>
-    <w:basedOn w:val="Normal"/>
-    <w:next w:val="BodyText"/>
-    <w:qFormat/>
-    <w:pPr>
-      <w:keepNext/>
-      <w:keepLines/>
-      <w:spacing w:after="300" w:before="100"/>
-    </w:pPr>
-    <w:rPr>
-      <w:sz w:val="20"/>
-      <w:szCs w:val="20"/>
-    </w:rPr>
-  </w:style>
-  <w:style w:styleId="Bibliography" w:type="paragraph">
-    <w:name w:val="Bibliography"/>
-    <w:basedOn w:val="Normal"/>
-    <w:next w:val="Bibliography"/>
-    <w:qFormat/>
-    <w:pPr/>
-    <w:rPr/>
-  </w:style>
-  <w:style w:styleId="Heading1" w:type="paragraph">
+  <w:style w:type="paragraph" w:styleId="Heading1">
     <w:name w:val="heading 1"/>
     <w:basedOn w:val="Normal"/>
     <w:next w:val="BodyText"/>
@@ -1685,17 +2793,17 @@
     <w:pPr>
       <w:keepNext/>
       <w:keepLines/>
-      <w:spacing w:after="80" w:before="360"/>
+      <w:spacing w:before="360" w:after="80"/>
       <w:outlineLvl w:val="0"/>
     </w:pPr>
     <w:rPr>
-      <w:rFonts w:asciiTheme="majorHAnsi" w:cstheme="majorBidi" w:eastAsiaTheme="majorEastAsia" w:hAnsiTheme="majorHAnsi"/>
-      <w:color w:themeColor="accent1" w:themeShade="BF" w:val="0F4761"/>
+      <w:rFonts w:asciiTheme="majorHAnsi" w:eastAsiaTheme="majorEastAsia" w:hAnsiTheme="majorHAnsi" w:cstheme="majorBidi"/>
+      <w:color w:val="0F4761" w:themeColor="accent1" w:themeShade="BF"/>
       <w:sz w:val="40"/>
       <w:szCs w:val="40"/>
     </w:rPr>
   </w:style>
-  <w:style w:styleId="Heading2" w:type="paragraph">
+  <w:style w:type="paragraph" w:styleId="Heading2">
     <w:name w:val="heading 2"/>
     <w:basedOn w:val="Normal"/>
     <w:next w:val="BodyText"/>
@@ -1708,17 +2816,17 @@
     <w:pPr>
       <w:keepNext/>
       <w:keepLines/>
-      <w:spacing w:after="80" w:before="160"/>
+      <w:spacing w:before="160" w:after="80"/>
       <w:outlineLvl w:val="1"/>
     </w:pPr>
     <w:rPr>
-      <w:rFonts w:asciiTheme="majorHAnsi" w:cstheme="majorBidi" w:eastAsiaTheme="majorEastAsia" w:hAnsiTheme="majorHAnsi"/>
-      <w:color w:themeColor="accent1" w:themeShade="BF" w:val="0F4761"/>
+      <w:rFonts w:asciiTheme="majorHAnsi" w:eastAsiaTheme="majorEastAsia" w:hAnsiTheme="majorHAnsi" w:cstheme="majorBidi"/>
+      <w:color w:val="0F4761" w:themeColor="accent1" w:themeShade="BF"/>
       <w:sz w:val="32"/>
       <w:szCs w:val="32"/>
     </w:rPr>
   </w:style>
-  <w:style w:styleId="Heading3" w:type="paragraph">
+  <w:style w:type="paragraph" w:styleId="Heading3">
     <w:name w:val="heading 3"/>
     <w:basedOn w:val="Normal"/>
     <w:next w:val="BodyText"/>
@@ -1731,17 +2839,17 @@
     <w:pPr>
       <w:keepNext/>
       <w:keepLines/>
-      <w:spacing w:after="80" w:before="160"/>
+      <w:spacing w:before="160" w:after="80"/>
       <w:outlineLvl w:val="2"/>
     </w:pPr>
     <w:rPr>
-      <w:rFonts w:cstheme="majorBidi" w:eastAsiaTheme="majorEastAsia"/>
-      <w:color w:themeColor="accent1" w:themeShade="BF" w:val="0F4761"/>
+      <w:rFonts w:eastAsiaTheme="majorEastAsia" w:cstheme="majorBidi"/>
+      <w:color w:val="0F4761" w:themeColor="accent1" w:themeShade="BF"/>
       <w:sz w:val="28"/>
       <w:szCs w:val="28"/>
     </w:rPr>
   </w:style>
-  <w:style w:styleId="Heading4" w:type="paragraph">
+  <w:style w:type="paragraph" w:styleId="Heading4">
     <w:name w:val="heading 4"/>
     <w:basedOn w:val="Normal"/>
     <w:next w:val="BodyText"/>
@@ -1754,17 +2862,17 @@
     <w:pPr>
       <w:keepNext/>
       <w:keepLines/>
-      <w:spacing w:after="40" w:before="80"/>
+      <w:spacing w:before="80" w:after="40"/>
       <w:outlineLvl w:val="3"/>
     </w:pPr>
     <w:rPr>
-      <w:rFonts w:cstheme="majorBidi" w:eastAsiaTheme="majorEastAsia"/>
+      <w:rFonts w:eastAsiaTheme="majorEastAsia" w:cstheme="majorBidi"/>
       <w:i/>
       <w:iCs/>
-      <w:color w:themeColor="accent1" w:themeShade="BF" w:val="0F4761"/>
-    </w:rPr>
-  </w:style>
-  <w:style w:styleId="Heading5" w:type="paragraph">
+      <w:color w:val="0F4761" w:themeColor="accent1" w:themeShade="BF"/>
+    </w:rPr>
+  </w:style>
+  <w:style w:type="paragraph" w:styleId="Heading5">
     <w:name w:val="heading 5"/>
     <w:basedOn w:val="Normal"/>
     <w:next w:val="BodyText"/>
@@ -1777,15 +2885,15 @@
     <w:pPr>
       <w:keepNext/>
       <w:keepLines/>
-      <w:spacing w:after="40" w:before="80"/>
+      <w:spacing w:before="80" w:after="40"/>
       <w:outlineLvl w:val="4"/>
     </w:pPr>
     <w:rPr>
-      <w:rFonts w:cstheme="majorBidi" w:eastAsiaTheme="majorEastAsia"/>
-      <w:color w:themeColor="accent1" w:themeShade="BF" w:val="0F4761"/>
-    </w:rPr>
-  </w:style>
-  <w:style w:styleId="Heading6" w:type="paragraph">
+      <w:rFonts w:eastAsiaTheme="majorEastAsia" w:cstheme="majorBidi"/>
+      <w:color w:val="0F4761" w:themeColor="accent1" w:themeShade="BF"/>
+    </w:rPr>
+  </w:style>
+  <w:style w:type="paragraph" w:styleId="Heading6">
     <w:name w:val="heading 6"/>
     <w:basedOn w:val="Normal"/>
     <w:next w:val="BodyText"/>
@@ -1798,17 +2906,17 @@
     <w:pPr>
       <w:keepNext/>
       <w:keepLines/>
-      <w:spacing w:after="0" w:before="40"/>
+      <w:spacing w:before="40" w:after="0"/>
       <w:outlineLvl w:val="5"/>
     </w:pPr>
     <w:rPr>
-      <w:rFonts w:cstheme="majorBidi" w:eastAsiaTheme="majorEastAsia"/>
+      <w:rFonts w:eastAsiaTheme="majorEastAsia" w:cstheme="majorBidi"/>
       <w:i/>
       <w:iCs/>
-      <w:color w:themeColor="text1" w:themeTint="A6" w:val="595959"/>
-    </w:rPr>
-  </w:style>
-  <w:style w:styleId="Heading7" w:type="paragraph">
+      <w:color w:val="595959" w:themeColor="text1" w:themeTint="A6"/>
+    </w:rPr>
+  </w:style>
+  <w:style w:type="paragraph" w:styleId="Heading7">
     <w:name w:val="heading 7"/>
     <w:basedOn w:val="Normal"/>
     <w:next w:val="BodyText"/>
@@ -1821,15 +2929,15 @@
     <w:pPr>
       <w:keepNext/>
       <w:keepLines/>
-      <w:spacing w:after="0" w:before="40"/>
+      <w:spacing w:before="40" w:after="0"/>
       <w:outlineLvl w:val="6"/>
     </w:pPr>
     <w:rPr>
-      <w:rFonts w:cstheme="majorBidi" w:eastAsiaTheme="majorEastAsia"/>
-      <w:color w:themeColor="text1" w:themeTint="A6" w:val="595959"/>
-    </w:rPr>
-  </w:style>
-  <w:style w:styleId="Heading8" w:type="paragraph">
+      <w:rFonts w:eastAsiaTheme="majorEastAsia" w:cstheme="majorBidi"/>
+      <w:color w:val="595959" w:themeColor="text1" w:themeTint="A6"/>
+    </w:rPr>
+  </w:style>
+  <w:style w:type="paragraph" w:styleId="Heading8">
     <w:name w:val="heading 8"/>
     <w:basedOn w:val="Normal"/>
     <w:next w:val="BodyText"/>
@@ -1846,13 +2954,13 @@
       <w:outlineLvl w:val="7"/>
     </w:pPr>
     <w:rPr>
-      <w:rFonts w:cstheme="majorBidi" w:eastAsiaTheme="majorEastAsia"/>
+      <w:rFonts w:eastAsiaTheme="majorEastAsia" w:cstheme="majorBidi"/>
       <w:i/>
       <w:iCs/>
-      <w:color w:themeColor="text1" w:themeTint="D8" w:val="272727"/>
-    </w:rPr>
-  </w:style>
-  <w:style w:styleId="Heading9" w:type="paragraph">
+      <w:color w:val="272727" w:themeColor="text1" w:themeTint="D8"/>
+    </w:rPr>
+  </w:style>
+  <w:style w:type="paragraph" w:styleId="Heading9">
     <w:name w:val="heading 9"/>
     <w:basedOn w:val="Normal"/>
     <w:next w:val="BodyText"/>
@@ -1869,24 +2977,202 @@
       <w:outlineLvl w:val="8"/>
     </w:pPr>
     <w:rPr>
-      <w:rFonts w:cstheme="majorBidi" w:eastAsiaTheme="majorEastAsia"/>
-      <w:color w:themeColor="text1" w:themeTint="D8" w:val="272727"/>
-    </w:rPr>
-  </w:style>
-  <w:style w:customStyle="1" w:styleId="Heading1Char" w:type="character">
+      <w:rFonts w:eastAsiaTheme="majorEastAsia" w:cstheme="majorBidi"/>
+      <w:color w:val="272727" w:themeColor="text1" w:themeTint="D8"/>
+    </w:rPr>
+  </w:style>
+  <w:style w:type="character" w:default="1" w:styleId="DefaultParagraphFont">
+    <w:name w:val="Default Paragraph Font"/>
+    <w:uiPriority w:val="1"/>
+    <w:semiHidden/>
+    <w:unhideWhenUsed/>
+  </w:style>
+  <w:style w:type="table" w:default="1" w:styleId="TableNormal">
+    <w:name w:val="Normal Table"/>
+    <w:uiPriority w:val="99"/>
+    <w:semiHidden/>
+    <w:unhideWhenUsed/>
+    <w:tblPr>
+      <w:tblInd w:w="0" w:type="dxa"/>
+      <w:tblCellMar>
+        <w:top w:w="0" w:type="dxa"/>
+        <w:left w:w="108" w:type="dxa"/>
+        <w:bottom w:w="0" w:type="dxa"/>
+        <w:right w:w="108" w:type="dxa"/>
+      </w:tblCellMar>
+    </w:tblPr>
+  </w:style>
+  <w:style w:type="numbering" w:default="1" w:styleId="NoList">
+    <w:name w:val="No List"/>
+    <w:uiPriority w:val="99"/>
+    <w:semiHidden/>
+    <w:unhideWhenUsed/>
+  </w:style>
+  <w:style w:type="paragraph" w:styleId="BodyText">
+    <w:name w:val="Body Text"/>
+    <w:basedOn w:val="Normal"/>
+    <w:qFormat/>
+    <w:pPr>
+      <w:spacing w:before="180" w:after="180"/>
+    </w:pPr>
+  </w:style>
+  <w:style w:type="paragraph" w:customStyle="1" w:styleId="FirstParagraph">
+    <w:name w:val="First Paragraph"/>
+    <w:basedOn w:val="BodyText"/>
+    <w:next w:val="BodyText"/>
+    <w:qFormat/>
+  </w:style>
+  <w:style w:type="paragraph" w:customStyle="1" w:styleId="Compact">
+    <w:name w:val="Compact"/>
+    <w:basedOn w:val="BodyText"/>
+    <w:qFormat/>
+    <w:pPr>
+      <w:spacing w:before="36" w:after="36"/>
+    </w:pPr>
+  </w:style>
+  <w:style w:type="paragraph" w:styleId="Title">
+    <w:name w:val="Title"/>
+    <w:basedOn w:val="Normal"/>
+    <w:next w:val="BodyText"/>
+    <w:link w:val="TitleChar"/>
+    <w:uiPriority w:val="10"/>
+    <w:qFormat/>
+    <w:rsid w:val="00A10FD9"/>
+    <w:pPr>
+      <w:spacing w:after="80"/>
+      <w:contextualSpacing/>
+      <w:jc w:val="center"/>
+    </w:pPr>
+    <w:rPr>
+      <w:rFonts w:asciiTheme="majorHAnsi" w:eastAsiaTheme="majorEastAsia" w:hAnsiTheme="majorHAnsi" w:cstheme="majorBidi"/>
+      <w:sz w:val="56"/>
+      <w:szCs w:val="56"/>
+    </w:rPr>
+  </w:style>
+  <w:style w:type="character" w:customStyle="1" w:styleId="TitleChar">
+    <w:name w:val="Title Char"/>
+    <w:basedOn w:val="DefaultParagraphFont"/>
+    <w:link w:val="Title"/>
+    <w:uiPriority w:val="10"/>
+    <w:rsid w:val="00A10FD9"/>
+    <w:rPr>
+      <w:rFonts w:asciiTheme="majorHAnsi" w:eastAsiaTheme="majorEastAsia" w:hAnsiTheme="majorHAnsi" w:cstheme="majorBidi"/>
+      <w:sz w:val="56"/>
+      <w:szCs w:val="56"/>
+    </w:rPr>
+  </w:style>
+  <w:style w:type="paragraph" w:styleId="Subtitle">
+    <w:name w:val="Subtitle"/>
+    <w:basedOn w:val="Title"/>
+    <w:next w:val="BodyText"/>
+    <w:link w:val="SubtitleChar"/>
+    <w:uiPriority w:val="11"/>
+    <w:qFormat/>
+    <w:rsid w:val="00A10FD9"/>
+    <w:pPr>
+      <w:numPr>
+        <w:ilvl w:val="1"/>
+      </w:numPr>
+    </w:pPr>
+    <w:rPr>
+      <w:spacing w:val="15"/>
+      <w:sz w:val="28"/>
+      <w:szCs w:val="28"/>
+    </w:rPr>
+  </w:style>
+  <w:style w:type="character" w:customStyle="1" w:styleId="SubtitleChar">
+    <w:name w:val="Subtitle Char"/>
+    <w:basedOn w:val="DefaultParagraphFont"/>
+    <w:link w:val="Subtitle"/>
+    <w:uiPriority w:val="11"/>
+    <w:rsid w:val="00A10FD9"/>
+    <w:rPr>
+      <w:rFonts w:eastAsiaTheme="majorEastAsia" w:cstheme="majorBidi"/>
+      <w:color w:val="595959" w:themeColor="text1" w:themeTint="A6"/>
+      <w:spacing w:val="15"/>
+      <w:sz w:val="28"/>
+      <w:szCs w:val="28"/>
+    </w:rPr>
+  </w:style>
+  <w:style w:type="paragraph" w:customStyle="1" w:styleId="Author">
+    <w:name w:val="Author"/>
+    <w:basedOn w:val="Title"/>
+    <w:next w:val="BodyText"/>
+    <w:qFormat/>
+    <w:pPr>
+      <w:keepNext/>
+      <w:keepLines/>
+    </w:pPr>
+    <w:rPr>
+      <w:sz w:val="24"/>
+      <w:szCs w:val="24"/>
+    </w:rPr>
+  </w:style>
+  <w:style w:type="paragraph" w:styleId="Date">
+    <w:name w:val="Date"/>
+    <w:basedOn w:val="Title"/>
+    <w:next w:val="BodyText"/>
+    <w:qFormat/>
+    <w:pPr>
+      <w:keepNext/>
+      <w:keepLines/>
+    </w:pPr>
+    <w:rPr>
+      <w:sz w:val="24"/>
+      <w:szCs w:val="24"/>
+    </w:rPr>
+  </w:style>
+  <w:style w:type="paragraph" w:customStyle="1" w:styleId="AbstractTitle">
+    <w:name w:val="Abstract Title"/>
+    <w:basedOn w:val="Normal"/>
+    <w:next w:val="Abstract"/>
+    <w:qFormat/>
+    <w:pPr>
+      <w:keepNext/>
+      <w:keepLines/>
+      <w:spacing w:before="300" w:after="0"/>
+      <w:jc w:val="center"/>
+    </w:pPr>
+    <w:rPr>
+      <w:b/>
+      <w:sz w:val="20"/>
+      <w:szCs w:val="20"/>
+    </w:rPr>
+  </w:style>
+  <w:style w:type="paragraph" w:customStyle="1" w:styleId="Abstract">
+    <w:name w:val="Abstract"/>
+    <w:basedOn w:val="Normal"/>
+    <w:next w:val="BodyText"/>
+    <w:qFormat/>
+    <w:pPr>
+      <w:keepNext/>
+      <w:keepLines/>
+      <w:spacing w:before="100" w:after="300"/>
+    </w:pPr>
+    <w:rPr>
+      <w:sz w:val="20"/>
+      <w:szCs w:val="20"/>
+    </w:rPr>
+  </w:style>
+  <w:style w:type="paragraph" w:styleId="Bibliography">
+    <w:name w:val="Bibliography"/>
+    <w:basedOn w:val="Normal"/>
+    <w:qFormat/>
+  </w:style>
+  <w:style w:type="character" w:customStyle="1" w:styleId="Heading1Char">
     <w:name w:val="Heading 1 Char"/>
     <w:basedOn w:val="DefaultParagraphFont"/>
     <w:link w:val="Heading1"/>
     <w:uiPriority w:val="9"/>
     <w:rsid w:val="00A10FD9"/>
     <w:rPr>
-      <w:rFonts w:asciiTheme="majorHAnsi" w:cstheme="majorBidi" w:eastAsiaTheme="majorEastAsia" w:hAnsiTheme="majorHAnsi"/>
-      <w:color w:themeColor="accent1" w:themeShade="BF" w:val="0F4761"/>
+      <w:rFonts w:asciiTheme="majorHAnsi" w:eastAsiaTheme="majorEastAsia" w:hAnsiTheme="majorHAnsi" w:cstheme="majorBidi"/>
+      <w:color w:val="0F4761" w:themeColor="accent1" w:themeShade="BF"/>
       <w:sz w:val="40"/>
       <w:szCs w:val="40"/>
     </w:rPr>
   </w:style>
-  <w:style w:customStyle="1" w:styleId="Heading2Char" w:type="character">
+  <w:style w:type="character" w:customStyle="1" w:styleId="Heading2Char">
     <w:name w:val="Heading 2 Char"/>
     <w:basedOn w:val="DefaultParagraphFont"/>
     <w:link w:val="Heading2"/>
@@ -1894,13 +3180,13 @@
     <w:semiHidden/>
     <w:rsid w:val="00A10FD9"/>
     <w:rPr>
-      <w:rFonts w:asciiTheme="majorHAnsi" w:cstheme="majorBidi" w:eastAsiaTheme="majorEastAsia" w:hAnsiTheme="majorHAnsi"/>
-      <w:color w:themeColor="accent1" w:themeShade="BF" w:val="0F4761"/>
+      <w:rFonts w:asciiTheme="majorHAnsi" w:eastAsiaTheme="majorEastAsia" w:hAnsiTheme="majorHAnsi" w:cstheme="majorBidi"/>
+      <w:color w:val="0F4761" w:themeColor="accent1" w:themeShade="BF"/>
       <w:sz w:val="32"/>
       <w:szCs w:val="32"/>
     </w:rPr>
   </w:style>
-  <w:style w:customStyle="1" w:styleId="Heading3Char" w:type="character">
+  <w:style w:type="character" w:customStyle="1" w:styleId="Heading3Char">
     <w:name w:val="Heading 3 Char"/>
     <w:basedOn w:val="DefaultParagraphFont"/>
     <w:link w:val="Heading3"/>
@@ -1908,13 +3194,13 @@
     <w:semiHidden/>
     <w:rsid w:val="00A10FD9"/>
     <w:rPr>
-      <w:rFonts w:cstheme="majorBidi" w:eastAsiaTheme="majorEastAsia"/>
-      <w:color w:themeColor="accent1" w:themeShade="BF" w:val="0F4761"/>
+      <w:rFonts w:eastAsiaTheme="majorEastAsia" w:cstheme="majorBidi"/>
+      <w:color w:val="0F4761" w:themeColor="accent1" w:themeShade="BF"/>
       <w:sz w:val="28"/>
       <w:szCs w:val="28"/>
     </w:rPr>
   </w:style>
-  <w:style w:customStyle="1" w:styleId="Heading4Char" w:type="character">
+  <w:style w:type="character" w:customStyle="1" w:styleId="Heading4Char">
     <w:name w:val="Heading 4 Char"/>
     <w:basedOn w:val="DefaultParagraphFont"/>
     <w:link w:val="Heading4"/>
@@ -1922,13 +3208,13 @@
     <w:semiHidden/>
     <w:rsid w:val="00A10FD9"/>
     <w:rPr>
-      <w:rFonts w:cstheme="majorBidi" w:eastAsiaTheme="majorEastAsia"/>
+      <w:rFonts w:eastAsiaTheme="majorEastAsia" w:cstheme="majorBidi"/>
       <w:i/>
       <w:iCs/>
-      <w:color w:themeColor="accent1" w:themeShade="BF" w:val="0F4761"/>
-    </w:rPr>
-  </w:style>
-  <w:style w:customStyle="1" w:styleId="Heading5Char" w:type="character">
+      <w:color w:val="0F4761" w:themeColor="accent1" w:themeShade="BF"/>
+    </w:rPr>
+  </w:style>
+  <w:style w:type="character" w:customStyle="1" w:styleId="Heading5Char">
     <w:name w:val="Heading 5 Char"/>
     <w:basedOn w:val="DefaultParagraphFont"/>
     <w:link w:val="Heading5"/>
@@ -1936,11 +3222,11 @@
     <w:semiHidden/>
     <w:rsid w:val="00A10FD9"/>
     <w:rPr>
-      <w:rFonts w:cstheme="majorBidi" w:eastAsiaTheme="majorEastAsia"/>
-      <w:color w:themeColor="accent1" w:themeShade="BF" w:val="0F4761"/>
-    </w:rPr>
-  </w:style>
-  <w:style w:customStyle="1" w:styleId="Heading6Char" w:type="character">
+      <w:rFonts w:eastAsiaTheme="majorEastAsia" w:cstheme="majorBidi"/>
+      <w:color w:val="0F4761" w:themeColor="accent1" w:themeShade="BF"/>
+    </w:rPr>
+  </w:style>
+  <w:style w:type="character" w:customStyle="1" w:styleId="Heading6Char">
     <w:name w:val="Heading 6 Char"/>
     <w:basedOn w:val="DefaultParagraphFont"/>
     <w:link w:val="Heading6"/>
@@ -1948,13 +3234,13 @@
     <w:semiHidden/>
     <w:rsid w:val="00A10FD9"/>
     <w:rPr>
-      <w:rFonts w:cstheme="majorBidi" w:eastAsiaTheme="majorEastAsia"/>
+      <w:rFonts w:eastAsiaTheme="majorEastAsia" w:cstheme="majorBidi"/>
       <w:i/>
       <w:iCs/>
-      <w:color w:themeColor="text1" w:themeTint="A6" w:val="595959"/>
-    </w:rPr>
-  </w:style>
-  <w:style w:customStyle="1" w:styleId="Heading7Char" w:type="character">
+      <w:color w:val="595959" w:themeColor="text1" w:themeTint="A6"/>
+    </w:rPr>
+  </w:style>
+  <w:style w:type="character" w:customStyle="1" w:styleId="Heading7Char">
     <w:name w:val="Heading 7 Char"/>
     <w:basedOn w:val="DefaultParagraphFont"/>
     <w:link w:val="Heading7"/>
@@ -1962,11 +3248,11 @@
     <w:semiHidden/>
     <w:rsid w:val="00A10FD9"/>
     <w:rPr>
-      <w:rFonts w:cstheme="majorBidi" w:eastAsiaTheme="majorEastAsia"/>
-      <w:color w:themeColor="text1" w:themeTint="A6" w:val="595959"/>
-    </w:rPr>
-  </w:style>
-  <w:style w:customStyle="1" w:styleId="Heading8Char" w:type="character">
+      <w:rFonts w:eastAsiaTheme="majorEastAsia" w:cstheme="majorBidi"/>
+      <w:color w:val="595959" w:themeColor="text1" w:themeTint="A6"/>
+    </w:rPr>
+  </w:style>
+  <w:style w:type="character" w:customStyle="1" w:styleId="Heading8Char">
     <w:name w:val="Heading 8 Char"/>
     <w:basedOn w:val="DefaultParagraphFont"/>
     <w:link w:val="Heading8"/>
@@ -1974,13 +3260,13 @@
     <w:semiHidden/>
     <w:rsid w:val="00A10FD9"/>
     <w:rPr>
-      <w:rFonts w:cstheme="majorBidi" w:eastAsiaTheme="majorEastAsia"/>
+      <w:rFonts w:eastAsiaTheme="majorEastAsia" w:cstheme="majorBidi"/>
       <w:i/>
       <w:iCs/>
-      <w:color w:themeColor="text1" w:themeTint="D8" w:val="272727"/>
-    </w:rPr>
-  </w:style>
-  <w:style w:customStyle="1" w:styleId="Heading9Char" w:type="character">
+      <w:color w:val="272727" w:themeColor="text1" w:themeTint="D8"/>
+    </w:rPr>
+  </w:style>
+  <w:style w:type="character" w:customStyle="1" w:styleId="Heading9Char">
     <w:name w:val="Heading 9 Char"/>
     <w:basedOn w:val="DefaultParagraphFont"/>
     <w:link w:val="Heading9"/>
@@ -1988,11 +3274,11 @@
     <w:semiHidden/>
     <w:rsid w:val="00A10FD9"/>
     <w:rPr>
-      <w:rFonts w:cstheme="majorBidi" w:eastAsiaTheme="majorEastAsia"/>
-      <w:color w:themeColor="text1" w:themeTint="D8" w:val="272727"/>
-    </w:rPr>
-  </w:style>
-  <w:style w:styleId="BlockText" w:type="paragraph">
+      <w:rFonts w:eastAsiaTheme="majorEastAsia" w:cstheme="majorBidi"/>
+      <w:color w:val="272727" w:themeColor="text1" w:themeTint="D8"/>
+    </w:rPr>
+  </w:style>
+  <w:style w:type="paragraph" w:styleId="BlockText">
     <w:name w:val="Block Text"/>
     <w:basedOn w:val="BodyText"/>
     <w:next w:val="BodyText"/>
@@ -2000,19 +3286,18 @@
     <w:unhideWhenUsed/>
     <w:qFormat/>
     <w:pPr>
-      <w:spacing w:after="100" w:before="100"/>
-      <w:ind w:firstLine="0" w:left="480" w:right="480"/>
+      <w:spacing w:before="100" w:after="100"/>
+      <w:ind w:left="480" w:right="480"/>
     </w:pPr>
   </w:style>
-  <w:style w:styleId="FootnoteText" w:type="paragraph">
-    <w:name w:val="Footnote Text"/>
+  <w:style w:type="paragraph" w:styleId="FootnoteText">
+    <w:name w:val="footnote text"/>
     <w:basedOn w:val="Normal"/>
-    <w:next w:val="FootnoteText"/>
     <w:uiPriority w:val="9"/>
     <w:unhideWhenUsed/>
     <w:qFormat/>
   </w:style>
-  <w:style w:styleId="FootnoteBlockText" w:type="paragraph">
+  <w:style w:type="paragraph" w:customStyle="1" w:styleId="FootnoteBlockText">
     <w:name w:val="Footnote Block Text"/>
     <w:basedOn w:val="FootnoteText"/>
     <w:next w:val="FootnoteText"/>
@@ -2020,40 +3305,35 @@
     <w:unhideWhenUsed/>
     <w:qFormat/>
     <w:pPr>
-      <w:spacing w:after="100" w:before="100"/>
-      <w:ind w:firstLine="0" w:left="480" w:right="480"/>
+      <w:spacing w:before="100" w:after="100"/>
+      <w:ind w:left="480" w:right="480"/>
     </w:pPr>
   </w:style>
-  <w:style w:default="1" w:styleId="DefaultParagraphFont" w:type="character">
-    <w:name w:val="Default Paragraph Font"/>
-    <w:semiHidden/>
-    <w:unhideWhenUsed/>
-  </w:style>
-  <w:style w:default="1" w:styleId="Table" w:type="table">
+  <w:style w:type="table" w:customStyle="1" w:styleId="Table">
     <w:name w:val="Table"/>
-    <w:basedOn w:val="TableNormal"/>
     <w:semiHidden/>
     <w:unhideWhenUsed/>
     <w:qFormat/>
     <w:tblPr>
-      <w:tblInd w:type="dxa" w:w="0"/>
+      <w:tblInd w:w="0" w:type="dxa"/>
       <w:tblCellMar>
-        <w:top w:type="dxa" w:w="0"/>
-        <w:left w:type="dxa" w:w="108"/>
-        <w:bottom w:type="dxa" w:w="0"/>
-        <w:right w:type="dxa" w:w="108"/>
+        <w:top w:w="0" w:type="dxa"/>
+        <w:left w:w="108" w:type="dxa"/>
+        <w:bottom w:w="0" w:type="dxa"/>
+        <w:right w:w="108" w:type="dxa"/>
       </w:tblCellMar>
     </w:tblPr>
     <w:tblStylePr w:type="firstRow">
+      <w:tblPr/>
       <w:tcPr>
         <w:tcBorders>
-          <w:bottom w:val="single"/>
+          <w:bottom w:val="single" w:sz="0" w:space="0" w:color="auto"/>
         </w:tcBorders>
         <w:vAlign w:val="bottom"/>
       </w:tcPr>
     </w:tblStylePr>
   </w:style>
-  <w:style w:customStyle="1" w:styleId="DefinitionTerm" w:type="paragraph">
+  <w:style w:type="paragraph" w:customStyle="1" w:styleId="DefinitionTerm">
     <w:name w:val="Definition Term"/>
     <w:basedOn w:val="Normal"/>
     <w:next w:val="Definition"/>
@@ -2066,75 +3346,77 @@
       <w:b/>
     </w:rPr>
   </w:style>
-  <w:style w:customStyle="1" w:styleId="Definition" w:type="paragraph">
+  <w:style w:type="paragraph" w:customStyle="1" w:styleId="Definition">
     <w:name w:val="Definition"/>
     <w:basedOn w:val="Normal"/>
   </w:style>
-  <w:style w:styleId="Caption" w:type="paragraph">
-    <w:name w:val="Caption"/>
+  <w:style w:type="paragraph" w:styleId="Caption">
+    <w:name w:val="caption"/>
     <w:basedOn w:val="Normal"/>
-    <w:link w:val="BodyTextChar"/>
+    <w:link w:val="CaptionChar"/>
     <w:pPr>
-      <w:spacing w:after="120" w:before="0"/>
+      <w:spacing w:after="120"/>
     </w:pPr>
     <w:rPr>
       <w:i/>
     </w:rPr>
   </w:style>
-  <w:style w:customStyle="1" w:styleId="TableCaption" w:type="paragraph">
+  <w:style w:type="paragraph" w:customStyle="1" w:styleId="TableCaption">
     <w:name w:val="Table Caption"/>
     <w:basedOn w:val="Caption"/>
     <w:pPr>
       <w:keepNext/>
     </w:pPr>
   </w:style>
-  <w:style w:customStyle="1" w:styleId="ImageCaption" w:type="paragraph">
+  <w:style w:type="paragraph" w:customStyle="1" w:styleId="ImageCaption">
     <w:name w:val="Image Caption"/>
     <w:basedOn w:val="Caption"/>
   </w:style>
-  <w:style w:customStyle="1" w:styleId="Figure" w:type="paragraph">
+  <w:style w:type="paragraph" w:customStyle="1" w:styleId="Figure">
     <w:name w:val="Figure"/>
     <w:basedOn w:val="Normal"/>
   </w:style>
-  <w:style w:customStyle="1" w:styleId="CaptionedFigure" w:type="paragraph">
+  <w:style w:type="paragraph" w:customStyle="1" w:styleId="CaptionedFigure">
     <w:name w:val="Captioned Figure"/>
     <w:basedOn w:val="Figure"/>
     <w:pPr>
       <w:keepNext/>
     </w:pPr>
   </w:style>
-  <w:style w:customStyle="1" w:styleId="BodyTextChar" w:type="character">
-    <w:name w:val="Body Text Char"/>
+  <w:style w:type="character" w:customStyle="1" w:styleId="CaptionChar">
+    <w:name w:val="Caption Char"/>
     <w:basedOn w:val="DefaultParagraphFont"/>
-    <w:link w:val="BodyText"/>
-  </w:style>
-  <w:style w:customStyle="1" w:styleId="VerbatimChar" w:type="character">
+    <w:link w:val="Caption"/>
+  </w:style>
+  <w:style w:type="character" w:customStyle="1" w:styleId="VerbatimChar">
     <w:name w:val="Verbatim Char"/>
-    <w:basedOn w:val="BodyTextChar"/>
+    <w:basedOn w:val="CaptionChar"/>
+    <w:link w:val="SourceCode"/>
     <w:rPr>
       <w:rFonts w:ascii="Consolas" w:hAnsi="Consolas"/>
       <w:sz w:val="22"/>
     </w:rPr>
   </w:style>
-  <w:style w:customStyle="1" w:styleId="SectionNumber" w:type="character">
+  <w:style w:type="character" w:customStyle="1" w:styleId="SectionNumber">
     <w:name w:val="Section Number"/>
-    <w:basedOn w:val="BodyTextChar"/>
-  </w:style>
-  <w:style w:styleId="FootnoteReference" w:type="character">
-    <w:name w:val="Footnote Reference"/>
-    <w:basedOn w:val="BodyTextChar"/>
+    <w:basedOn w:val="CaptionChar"/>
+  </w:style>
+  <w:style w:type="character" w:styleId="FootnoteReference">
+    <w:name w:val="footnote reference"/>
+    <w:basedOn w:val="CaptionChar"/>
     <w:rPr>
       <w:vertAlign w:val="superscript"/>
     </w:rPr>
   </w:style>
-  <w:style w:styleId="Hyperlink" w:type="character">
+  <w:style w:type="character" w:styleId="Hyperlink">
     <w:name w:val="Hyperlink"/>
-    <w:basedOn w:val="BodyTextChar"/>
-    <w:rPr>
-      <w:color w:themeColor="accent1" w:val="4F81BD"/>
-    </w:rPr>
-  </w:style>
-  <w:style w:styleId="TOCHeading" w:type="paragraph">
+    <w:basedOn w:val="CaptionChar"/>
+    <w:uiPriority w:val="99"/>
+    <w:rPr>
+      <w:color w:val="156082" w:themeColor="accent1"/>
+    </w:rPr>
+  </w:style>
+  <w:style w:type="paragraph" w:styleId="TOCHeading">
     <w:name w:val="TOC Heading"/>
     <w:basedOn w:val="Heading1"/>
     <w:next w:val="BodyText"/>
@@ -2145,246 +3427,328 @@
       <w:spacing w:before="240" w:line="259" w:lineRule="auto"/>
       <w:outlineLvl w:val="9"/>
     </w:pPr>
-    <w:rPr>
-      <w:rFonts w:asciiTheme="majorHAnsi" w:cstheme="majorBidi" w:eastAsiaTheme="majorEastAsia" w:hAnsiTheme="majorHAnsi"/>
-      <w:b w:val="0"/>
-      <w:bCs w:val="0"/>
-      <w:color w:themeColor="accent1" w:themeShade="BF" w:val="365F91"/>
-    </w:rPr>
   </w:style>
   <w:style w:type="paragraph" w:customStyle="1" w:styleId="SourceCode">
     <w:name w:val="Source Code"/>
     <w:basedOn w:val="Normal"/>
     <w:link w:val="VerbatimChar"/>
     <w:pPr>
-      <w:wordWrap w:val="off"/>
+      <w:wordWrap w:val="0"/>
     </w:pPr>
   </w:style>
   <w:style w:type="character" w:customStyle="1" w:styleId="KeywordTok">
     <w:name w:val="KeywordTok"/>
     <w:basedOn w:val="VerbatimChar"/>
     <w:rPr>
+      <w:rFonts w:ascii="Consolas" w:hAnsi="Consolas"/>
       <w:b/>
       <w:color w:val="007020"/>
+      <w:sz w:val="22"/>
     </w:rPr>
   </w:style>
   <w:style w:type="character" w:customStyle="1" w:styleId="DataTypeTok">
     <w:name w:val="DataTypeTok"/>
     <w:basedOn w:val="VerbatimChar"/>
     <w:rPr>
+      <w:rFonts w:ascii="Consolas" w:hAnsi="Consolas"/>
       <w:color w:val="902000"/>
+      <w:sz w:val="22"/>
     </w:rPr>
   </w:style>
   <w:style w:type="character" w:customStyle="1" w:styleId="DecValTok">
     <w:name w:val="DecValTok"/>
     <w:basedOn w:val="VerbatimChar"/>
     <w:rPr>
-      <w:color w:val="40a070"/>
+      <w:rFonts w:ascii="Consolas" w:hAnsi="Consolas"/>
+      <w:color w:val="40A070"/>
+      <w:sz w:val="22"/>
     </w:rPr>
   </w:style>
   <w:style w:type="character" w:customStyle="1" w:styleId="BaseNTok">
     <w:name w:val="BaseNTok"/>
     <w:basedOn w:val="VerbatimChar"/>
     <w:rPr>
-      <w:color w:val="40a070"/>
+      <w:rFonts w:ascii="Consolas" w:hAnsi="Consolas"/>
+      <w:color w:val="40A070"/>
+      <w:sz w:val="22"/>
     </w:rPr>
   </w:style>
   <w:style w:type="character" w:customStyle="1" w:styleId="FloatTok">
     <w:name w:val="FloatTok"/>
     <w:basedOn w:val="VerbatimChar"/>
     <w:rPr>
-      <w:color w:val="40a070"/>
+      <w:rFonts w:ascii="Consolas" w:hAnsi="Consolas"/>
+      <w:color w:val="40A070"/>
+      <w:sz w:val="22"/>
     </w:rPr>
   </w:style>
   <w:style w:type="character" w:customStyle="1" w:styleId="ConstantTok">
     <w:name w:val="ConstantTok"/>
     <w:basedOn w:val="VerbatimChar"/>
     <w:rPr>
+      <w:rFonts w:ascii="Consolas" w:hAnsi="Consolas"/>
       <w:color w:val="880000"/>
+      <w:sz w:val="22"/>
     </w:rPr>
   </w:style>
   <w:style w:type="character" w:customStyle="1" w:styleId="CharTok">
     <w:name w:val="CharTok"/>
     <w:basedOn w:val="VerbatimChar"/>
     <w:rPr>
-      <w:color w:val="4070a0"/>
+      <w:rFonts w:ascii="Consolas" w:hAnsi="Consolas"/>
+      <w:color w:val="4070A0"/>
+      <w:sz w:val="22"/>
     </w:rPr>
   </w:style>
   <w:style w:type="character" w:customStyle="1" w:styleId="SpecialCharTok">
     <w:name w:val="SpecialCharTok"/>
     <w:basedOn w:val="VerbatimChar"/>
     <w:rPr>
-      <w:color w:val="4070a0"/>
+      <w:rFonts w:ascii="Consolas" w:hAnsi="Consolas"/>
+      <w:color w:val="4070A0"/>
+      <w:sz w:val="22"/>
     </w:rPr>
   </w:style>
   <w:style w:type="character" w:customStyle="1" w:styleId="StringTok">
     <w:name w:val="StringTok"/>
     <w:basedOn w:val="VerbatimChar"/>
     <w:rPr>
-      <w:color w:val="4070a0"/>
+      <w:rFonts w:ascii="Consolas" w:hAnsi="Consolas"/>
+      <w:color w:val="4070A0"/>
+      <w:sz w:val="22"/>
     </w:rPr>
   </w:style>
   <w:style w:type="character" w:customStyle="1" w:styleId="VerbatimStringTok">
     <w:name w:val="VerbatimStringTok"/>
     <w:basedOn w:val="VerbatimChar"/>
     <w:rPr>
-      <w:color w:val="4070a0"/>
+      <w:rFonts w:ascii="Consolas" w:hAnsi="Consolas"/>
+      <w:color w:val="4070A0"/>
+      <w:sz w:val="22"/>
     </w:rPr>
   </w:style>
   <w:style w:type="character" w:customStyle="1" w:styleId="SpecialStringTok">
     <w:name w:val="SpecialStringTok"/>
     <w:basedOn w:val="VerbatimChar"/>
     <w:rPr>
-      <w:color w:val="bb6688"/>
+      <w:rFonts w:ascii="Consolas" w:hAnsi="Consolas"/>
+      <w:color w:val="BB6688"/>
+      <w:sz w:val="22"/>
     </w:rPr>
   </w:style>
   <w:style w:type="character" w:customStyle="1" w:styleId="ImportTok">
     <w:name w:val="ImportTok"/>
     <w:basedOn w:val="VerbatimChar"/>
     <w:rPr>
+      <w:rFonts w:ascii="Consolas" w:hAnsi="Consolas"/>
       <w:b/>
       <w:color w:val="008000"/>
+      <w:sz w:val="22"/>
     </w:rPr>
   </w:style>
   <w:style w:type="character" w:customStyle="1" w:styleId="CommentTok">
     <w:name w:val="CommentTok"/>
     <w:basedOn w:val="VerbatimChar"/>
     <w:rPr>
+      <w:rFonts w:ascii="Consolas" w:hAnsi="Consolas"/>
       <w:i/>
-      <w:color w:val="60a0b0"/>
+      <w:color w:val="60A0B0"/>
+      <w:sz w:val="22"/>
     </w:rPr>
   </w:style>
   <w:style w:type="character" w:customStyle="1" w:styleId="DocumentationTok">
     <w:name w:val="DocumentationTok"/>
     <w:basedOn w:val="VerbatimChar"/>
     <w:rPr>
+      <w:rFonts w:ascii="Consolas" w:hAnsi="Consolas"/>
       <w:i/>
-      <w:color w:val="ba2121"/>
+      <w:color w:val="BA2121"/>
+      <w:sz w:val="22"/>
     </w:rPr>
   </w:style>
   <w:style w:type="character" w:customStyle="1" w:styleId="AnnotationTok">
     <w:name w:val="AnnotationTok"/>
     <w:basedOn w:val="VerbatimChar"/>
     <w:rPr>
+      <w:rFonts w:ascii="Consolas" w:hAnsi="Consolas"/>
       <w:b/>
       <w:i/>
-      <w:color w:val="60a0b0"/>
+      <w:color w:val="60A0B0"/>
+      <w:sz w:val="22"/>
     </w:rPr>
   </w:style>
   <w:style w:type="character" w:customStyle="1" w:styleId="CommentVarTok">
     <w:name w:val="CommentVarTok"/>
     <w:basedOn w:val="VerbatimChar"/>
     <w:rPr>
+      <w:rFonts w:ascii="Consolas" w:hAnsi="Consolas"/>
       <w:b/>
       <w:i/>
-      <w:color w:val="60a0b0"/>
+      <w:color w:val="60A0B0"/>
+      <w:sz w:val="22"/>
     </w:rPr>
   </w:style>
   <w:style w:type="character" w:customStyle="1" w:styleId="OtherTok">
     <w:name w:val="OtherTok"/>
     <w:basedOn w:val="VerbatimChar"/>
     <w:rPr>
+      <w:rFonts w:ascii="Consolas" w:hAnsi="Consolas"/>
       <w:color w:val="007020"/>
+      <w:sz w:val="22"/>
     </w:rPr>
   </w:style>
   <w:style w:type="character" w:customStyle="1" w:styleId="FunctionTok">
     <w:name w:val="FunctionTok"/>
     <w:basedOn w:val="VerbatimChar"/>
     <w:rPr>
-      <w:color w:val="06287e"/>
+      <w:rFonts w:ascii="Consolas" w:hAnsi="Consolas"/>
+      <w:color w:val="06287E"/>
+      <w:sz w:val="22"/>
     </w:rPr>
   </w:style>
   <w:style w:type="character" w:customStyle="1" w:styleId="VariableTok">
     <w:name w:val="VariableTok"/>
     <w:basedOn w:val="VerbatimChar"/>
     <w:rPr>
-      <w:color w:val="19177c"/>
+      <w:rFonts w:ascii="Consolas" w:hAnsi="Consolas"/>
+      <w:color w:val="19177C"/>
+      <w:sz w:val="22"/>
     </w:rPr>
   </w:style>
   <w:style w:type="character" w:customStyle="1" w:styleId="ControlFlowTok">
     <w:name w:val="ControlFlowTok"/>
     <w:basedOn w:val="VerbatimChar"/>
     <w:rPr>
+      <w:rFonts w:ascii="Consolas" w:hAnsi="Consolas"/>
       <w:b/>
       <w:color w:val="007020"/>
+      <w:sz w:val="22"/>
     </w:rPr>
   </w:style>
   <w:style w:type="character" w:customStyle="1" w:styleId="OperatorTok">
     <w:name w:val="OperatorTok"/>
     <w:basedOn w:val="VerbatimChar"/>
     <w:rPr>
+      <w:rFonts w:ascii="Consolas" w:hAnsi="Consolas"/>
       <w:color w:val="666666"/>
+      <w:sz w:val="22"/>
     </w:rPr>
   </w:style>
   <w:style w:type="character" w:customStyle="1" w:styleId="BuiltInTok">
     <w:name w:val="BuiltInTok"/>
     <w:basedOn w:val="VerbatimChar"/>
     <w:rPr>
+      <w:rFonts w:ascii="Consolas" w:hAnsi="Consolas"/>
       <w:color w:val="008000"/>
+      <w:sz w:val="22"/>
     </w:rPr>
   </w:style>
   <w:style w:type="character" w:customStyle="1" w:styleId="ExtensionTok">
     <w:name w:val="ExtensionTok"/>
     <w:basedOn w:val="VerbatimChar"/>
-    <w:rPr/>
+    <w:rPr>
+      <w:rFonts w:ascii="Consolas" w:hAnsi="Consolas"/>
+      <w:sz w:val="22"/>
+    </w:rPr>
   </w:style>
   <w:style w:type="character" w:customStyle="1" w:styleId="PreprocessorTok">
     <w:name w:val="PreprocessorTok"/>
     <w:basedOn w:val="VerbatimChar"/>
     <w:rPr>
-      <w:color w:val="bc7a00"/>
+      <w:rFonts w:ascii="Consolas" w:hAnsi="Consolas"/>
+      <w:color w:val="BC7A00"/>
+      <w:sz w:val="22"/>
     </w:rPr>
   </w:style>
   <w:style w:type="character" w:customStyle="1" w:styleId="AttributeTok">
     <w:name w:val="AttributeTok"/>
     <w:basedOn w:val="VerbatimChar"/>
     <w:rPr>
-      <w:color w:val="7d9029"/>
+      <w:rFonts w:ascii="Consolas" w:hAnsi="Consolas"/>
+      <w:color w:val="7D9029"/>
+      <w:sz w:val="22"/>
     </w:rPr>
   </w:style>
   <w:style w:type="character" w:customStyle="1" w:styleId="RegionMarkerTok">
     <w:name w:val="RegionMarkerTok"/>
     <w:basedOn w:val="VerbatimChar"/>
-    <w:rPr/>
+    <w:rPr>
+      <w:rFonts w:ascii="Consolas" w:hAnsi="Consolas"/>
+      <w:sz w:val="22"/>
+    </w:rPr>
   </w:style>
   <w:style w:type="character" w:customStyle="1" w:styleId="InformationTok">
     <w:name w:val="InformationTok"/>
     <w:basedOn w:val="VerbatimChar"/>
     <w:rPr>
+      <w:rFonts w:ascii="Consolas" w:hAnsi="Consolas"/>
       <w:b/>
       <w:i/>
-      <w:color w:val="60a0b0"/>
+      <w:color w:val="60A0B0"/>
+      <w:sz w:val="22"/>
     </w:rPr>
   </w:style>
   <w:style w:type="character" w:customStyle="1" w:styleId="WarningTok">
     <w:name w:val="WarningTok"/>
     <w:basedOn w:val="VerbatimChar"/>
     <w:rPr>
+      <w:rFonts w:ascii="Consolas" w:hAnsi="Consolas"/>
       <w:b/>
       <w:i/>
-      <w:color w:val="60a0b0"/>
+      <w:color w:val="60A0B0"/>
+      <w:sz w:val="22"/>
     </w:rPr>
   </w:style>
   <w:style w:type="character" w:customStyle="1" w:styleId="AlertTok">
     <w:name w:val="AlertTok"/>
     <w:basedOn w:val="VerbatimChar"/>
     <w:rPr>
+      <w:rFonts w:ascii="Consolas" w:hAnsi="Consolas"/>
       <w:b/>
-      <w:color w:val="ff0000"/>
+      <w:color w:val="FF0000"/>
+      <w:sz w:val="22"/>
     </w:rPr>
   </w:style>
   <w:style w:type="character" w:customStyle="1" w:styleId="ErrorTok">
     <w:name w:val="ErrorTok"/>
     <w:basedOn w:val="VerbatimChar"/>
     <w:rPr>
+      <w:rFonts w:ascii="Consolas" w:hAnsi="Consolas"/>
       <w:b/>
-      <w:color w:val="ff0000"/>
+      <w:color w:val="FF0000"/>
+      <w:sz w:val="22"/>
     </w:rPr>
   </w:style>
   <w:style w:type="character" w:customStyle="1" w:styleId="NormalTok">
     <w:name w:val="NormalTok"/>
     <w:basedOn w:val="VerbatimChar"/>
-    <w:rPr/>
+    <w:rPr>
+      <w:rFonts w:ascii="Consolas" w:hAnsi="Consolas"/>
+      <w:sz w:val="22"/>
+    </w:rPr>
+  </w:style>
+  <w:style w:type="paragraph" w:styleId="TOC1">
+    <w:name w:val="toc 1"/>
+    <w:basedOn w:val="Normal"/>
+    <w:next w:val="Normal"/>
+    <w:autoRedefine/>
+    <w:uiPriority w:val="39"/>
+    <w:rsid w:val="000A1391"/>
+    <w:pPr>
+      <w:spacing w:after="100"/>
+    </w:pPr>
+  </w:style>
+  <w:style w:type="paragraph" w:styleId="TOC2">
+    <w:name w:val="toc 2"/>
+    <w:basedOn w:val="Normal"/>
+    <w:next w:val="Normal"/>
+    <w:autoRedefine/>
+    <w:uiPriority w:val="39"/>
+    <w:rsid w:val="000A1391"/>
+    <w:pPr>
+      <w:spacing w:after="100"/>
+      <w:ind w:left="240"/>
+    </w:pPr>
   </w:style>
 </w:styles>
 </file>

</xml_diff>